<commit_message>
docs: met a jour le guide utilisateur (repartition 70/30, per diem multi-types, montant transport)
- Repartition AVANCE 70 % / RELIQUAT 30 % (au lieu de 33,33 / 66,67)
- Etape 2 du wizard : repartition detaillee par type de repas + champ transport
- Section 7 (calcul) : formule per diem = somme(taux x jours) + transport,
  avance = round(total x 70 %)
- Glossaire mis a jour
- .docx regenere depuis le script

Co-Authored-By: Claude Opus 4.8 <noreply@anthropic.com>
Claude-Session: https://claude.ai/code/session_01L7K7Rtf7o2GArDBx5dsJGF
</commit_message>
<xml_diff>
--- a/docs/Guide-Utilisateur-ANaTT.docx
+++ b/docs/Guide-Utilisateur-ANaTT.docx
@@ -358,7 +358,7 @@
         <w:pStyle w:val="ListBullet"/>
       </w:pPr>
       <w:r>
-        <w:t>Per diem : indemnité journalière, répartie en AVANCE (33,33 %) et RELIQUAT (66,67 %).</w:t>
+        <w:t>Per diem : indemnité journalière, répartie en AVANCE (70 %) et RELIQUAT (30 %).</w:t>
       </w:r>
     </w:p>
     <w:p>
@@ -2445,7 +2445,23 @@
         <w:pStyle w:val="ListBullet"/>
       </w:pPr>
       <w:r>
-        <w:t>Le per diem (montant total, avance, reliquat) se calcule en temps réel pour chaque bénéficiaire.</w:t>
+        <w:t>Répartition détaillée (facultative) : cochez « Répartition détaillée par type de repas » pour saisir le nombre de jours par type (ex. 1 jour « un repas » + 6 jours « journée complète »), comme sur l'état de paiement officiel. Sinon, un seul type × le nombre de jours suffit.</w:t>
+      </w:r>
+    </w:p>
+    <w:p>
+      <w:pPr>
+        <w:pStyle w:val="ListBullet"/>
+      </w:pPr>
+      <w:r>
+        <w:t>Transport (facultatif) : renseignez un montant de transport ; il s'ajoute au total et entre dans la répartition avance / reliquat.</w:t>
+      </w:r>
+    </w:p>
+    <w:p>
+      <w:pPr>
+        <w:pStyle w:val="ListBullet"/>
+      </w:pPr>
+      <w:r>
+        <w:t>Le per diem (per diem + transport = total, puis avance / reliquat) se calcule en temps réel pour chaque bénéficiaire.</w:t>
       </w:r>
     </w:p>
     <w:p>
@@ -2612,7 +2628,7 @@
           <w:b/>
           <w:i w:val="0"/>
         </w:rPr>
-        <w:t>Montant total = taux journalier (catégorie × zone × type de prise en charge) × nombre de jours.</w:t>
+        <w:t>Per diem = somme, pour chaque type de prise en charge, de (taux journalier × nombre de jours). Montant total = per diem + transport éventuel.</w:t>
       </w:r>
     </w:p>
     <w:p>
@@ -2628,7 +2644,7 @@
         <w:pStyle w:val="ListBullet"/>
       </w:pPr>
       <w:r>
-        <w:t>Avance = arrondi de (montant total ÷ 3), soit 33,33 %.</w:t>
+        <w:t>Répartition détaillée : un même bénéficiaire peut cumuler plusieurs types (ex. 1 jour « un repas » à 15 000 + 6 jours « journée complète » à 45 000 = 285 000), comme sur l'état de paiement officiel.</w:t>
       </w:r>
     </w:p>
     <w:p>
@@ -2636,7 +2652,23 @@
         <w:pStyle w:val="ListBullet"/>
       </w:pPr>
       <w:r>
-        <w:t>Reliquat = montant total − avance, soit 66,67 %.</w:t>
+        <w:t>Transport : montant facultatif ajouté au total avant la répartition avance / reliquat.</w:t>
+      </w:r>
+    </w:p>
+    <w:p>
+      <w:pPr>
+        <w:pStyle w:val="ListBullet"/>
+      </w:pPr>
+      <w:r>
+        <w:t>Avance = arrondi de (montant total × 70 %).</w:t>
+      </w:r>
+    </w:p>
+    <w:p>
+      <w:pPr>
+        <w:pStyle w:val="ListBullet"/>
+      </w:pPr>
+      <w:r>
+        <w:t>Reliquat = montant total − avance, soit 30 %.</w:t>
       </w:r>
     </w:p>
     <w:p>
@@ -4781,7 +4813,7 @@
                 <w:b w:val="0"/>
                 <w:sz w:val="20"/>
               </w:rPr>
-              <w:t>Tranches du per diem : 33,33 % puis 66,67 %.</w:t>
+              <w:t>Tranches du per diem : 70 % puis 30 %.</w:t>
             </w:r>
           </w:p>
         </w:tc>

</xml_diff>

<commit_message>
docs(guide): guide utilisateur 1.4 — nouveautés de la revue d'octobre 2026
- Chapitre « Nouveautés de la version 1.4 » (tableau domaine / changement / chapitre).
- Mises à jour : retranscription (un agent par mission), fiche OM (Valider /
  Rejeter sans état, filtre opérateur du paiement), amendement (refus si lot
  en attente de dépôt), état des reliquats au montant payable, per diem
  (transport conservé à 0 jour), paiements (gros lots, lot en erreur, lots
  complémentaires), barème (LECTEUR), séparation ordonnateur/payeur par membre,
  §13.3 Sauvegardes et restauration, annexes (ANNULE, séquence des lots), glossaire.
- Générateur : les étapes numérotées repartent à 1 à chaque titre ; largeurs de
  colonnes appliquées à la grille (respectées sous LibreOffice) ; année du pied
  de page dynamique.

Co-Authored-By: Claude Opus 5.5 <noreply@anthropic.com>
Claude-Session: https://claude.ai/code/session_01MUfkbbz4qHVd6KNyyZzHX8
</commit_message>
<xml_diff>
--- a/docs/Guide-Utilisateur-ANaTT.docx
+++ b/docs/Guide-Utilisateur-ANaTT.docx
@@ -153,7 +153,7 @@
           <w:b/>
           <w:color w:val="B8891A"/>
         </w:rPr>
-        <w:t>Version 1.3.0  •  Septembre 2026</w:t>
+        <w:t>Version 1.4.0  •  Octobre 2026</w:t>
       </w:r>
     </w:p>
     <w:p>
@@ -191,6 +191,613 @@
         <w:fldChar w:fldCharType="end"/>
       </w:r>
     </w:p>
+    <w:p>
+      <w:r>
+        <w:br w:type="page"/>
+      </w:r>
+    </w:p>
+    <w:p>
+      <w:pPr>
+        <w:pStyle w:val="Heading1"/>
+      </w:pPr>
+      <w:r>
+        <w:t>Nouveautés de la version 1.4 (octobre 2026)</w:t>
+      </w:r>
+    </w:p>
+    <w:p>
+      <w:r>
+        <w:rPr>
+          <w:b w:val="0"/>
+          <w:i w:val="0"/>
+        </w:rPr>
+        <w:t>Cette version renforce la sûreté des paiements et complète plusieurs écrans. Les changements visibles pour les utilisateurs sont résumés ci-dessous, avec le chapitre où ils sont détaillés.</w:t>
+      </w:r>
+    </w:p>
+    <w:tbl>
+      <w:tblPr>
+        <w:tblStyle w:val="TableGrid"/>
+        <w:tblW w:type="auto" w:w="0"/>
+        <w:jc w:val="center"/>
+        <w:tblLayout w:type="fixed"/>
+        <w:tblLook w:firstColumn="1" w:firstRow="1" w:lastColumn="0" w:lastRow="0" w:noHBand="0" w:noVBand="1" w:val="04A0"/>
+      </w:tblPr>
+      <w:tblGrid>
+        <w:gridCol w:w="2041"/>
+        <w:gridCol w:w="6236"/>
+        <w:gridCol w:w="1247"/>
+      </w:tblGrid>
+      <w:tr>
+        <w:tc>
+          <w:tcPr>
+            <w:tcW w:type="dxa" w:w="2041"/>
+            <w:shd w:val="clear" w:fill="1D9E4F"/>
+          </w:tcPr>
+          <w:p>
+            <w:r/>
+            <w:r>
+              <w:rPr>
+                <w:b/>
+                <w:color w:val="FFFFFF"/>
+                <w:sz w:val="20"/>
+              </w:rPr>
+              <w:t>Domaine</w:t>
+            </w:r>
+          </w:p>
+        </w:tc>
+        <w:tc>
+          <w:tcPr>
+            <w:tcW w:type="dxa" w:w="6236"/>
+            <w:shd w:val="clear" w:fill="1D9E4F"/>
+          </w:tcPr>
+          <w:p>
+            <w:r/>
+            <w:r>
+              <w:rPr>
+                <w:b/>
+                <w:color w:val="FFFFFF"/>
+                <w:sz w:val="20"/>
+              </w:rPr>
+              <w:t>Ce qui change</w:t>
+            </w:r>
+          </w:p>
+        </w:tc>
+        <w:tc>
+          <w:tcPr>
+            <w:tcW w:type="dxa" w:w="1247"/>
+            <w:shd w:val="clear" w:fill="1D9E4F"/>
+          </w:tcPr>
+          <w:p>
+            <w:r/>
+            <w:r>
+              <w:rPr>
+                <w:b/>
+                <w:color w:val="FFFFFF"/>
+                <w:sz w:val="20"/>
+              </w:rPr>
+              <w:t>Chapitre</w:t>
+            </w:r>
+          </w:p>
+        </w:tc>
+      </w:tr>
+      <w:tr>
+        <w:tc>
+          <w:tcPr>
+            <w:tcW w:type="dxa" w:w="2041"/>
+          </w:tcPr>
+          <w:p>
+            <w:r/>
+            <w:r>
+              <w:rPr>
+                <w:b w:val="0"/>
+                <w:sz w:val="20"/>
+              </w:rPr>
+              <w:t>État des reliquats</w:t>
+            </w:r>
+          </w:p>
+        </w:tc>
+        <w:tc>
+          <w:tcPr>
+            <w:tcW w:type="dxa" w:w="6236"/>
+          </w:tcPr>
+          <w:p>
+            <w:r/>
+            <w:r>
+              <w:rPr>
+                <w:b w:val="0"/>
+                <w:sz w:val="20"/>
+              </w:rPr>
+              <w:t>Il est signé au montant réellement payé (somme des reliquats positifs). Les trop-perçus figurent à part sur le PDF, hors total.</w:t>
+            </w:r>
+          </w:p>
+        </w:tc>
+        <w:tc>
+          <w:tcPr>
+            <w:tcW w:type="dxa" w:w="1247"/>
+          </w:tcPr>
+          <w:p>
+            <w:r/>
+            <w:r>
+              <w:rPr>
+                <w:b w:val="0"/>
+                <w:sz w:val="20"/>
+              </w:rPr>
+              <w:t>7.3</w:t>
+            </w:r>
+          </w:p>
+        </w:tc>
+      </w:tr>
+      <w:tr>
+        <w:tc>
+          <w:tcPr>
+            <w:tcW w:type="dxa" w:w="2041"/>
+          </w:tcPr>
+          <w:p>
+            <w:r/>
+            <w:r>
+              <w:rPr>
+                <w:b w:val="0"/>
+                <w:sz w:val="20"/>
+              </w:rPr>
+              <w:t>Lots complémentaires</w:t>
+            </w:r>
+          </w:p>
+        </w:tc>
+        <w:tc>
+          <w:tcPr>
+            <w:tcW w:type="dxa" w:w="6236"/>
+          </w:tcPr>
+          <w:p>
+            <w:r/>
+            <w:r>
+              <w:rPr>
+                <w:b w:val="0"/>
+                <w:sz w:val="20"/>
+              </w:rPr>
+              <w:t>Un versement devenu payable après la confirmation d'un lot part dans un nouveau lot « complémentaire » ; le lot confirmé n'est jamais réécrit.</w:t>
+            </w:r>
+          </w:p>
+        </w:tc>
+        <w:tc>
+          <w:tcPr>
+            <w:tcW w:type="dxa" w:w="1247"/>
+          </w:tcPr>
+          <w:p>
+            <w:r/>
+            <w:r>
+              <w:rPr>
+                <w:b w:val="0"/>
+                <w:sz w:val="20"/>
+              </w:rPr>
+              <w:t>9.3</w:t>
+            </w:r>
+          </w:p>
+        </w:tc>
+      </w:tr>
+      <w:tr>
+        <w:tc>
+          <w:tcPr>
+            <w:tcW w:type="dxa" w:w="2041"/>
+          </w:tcPr>
+          <w:p>
+            <w:r/>
+            <w:r>
+              <w:rPr>
+                <w:b w:val="0"/>
+                <w:sz w:val="20"/>
+              </w:rPr>
+              <w:t>Lot en erreur</w:t>
+            </w:r>
+          </w:p>
+        </w:tc>
+        <w:tc>
+          <w:tcPr>
+            <w:tcW w:type="dxa" w:w="6236"/>
+          </w:tcPr>
+          <w:p>
+            <w:r/>
+            <w:r>
+              <w:rPr>
+                <w:b w:val="0"/>
+                <w:sz w:val="20"/>
+              </w:rPr>
+              <w:t>Les versements d'un lot signalé en erreur redeviennent en attente et reprennent le numéro actuel de l'agent : corrigez la fiche agent, puis régénérez.</w:t>
+            </w:r>
+          </w:p>
+        </w:tc>
+        <w:tc>
+          <w:tcPr>
+            <w:tcW w:type="dxa" w:w="1247"/>
+          </w:tcPr>
+          <w:p>
+            <w:r/>
+            <w:r>
+              <w:rPr>
+                <w:b w:val="0"/>
+                <w:sz w:val="20"/>
+              </w:rPr>
+              <w:t>9.3</w:t>
+            </w:r>
+          </w:p>
+        </w:tc>
+      </w:tr>
+      <w:tr>
+        <w:tc>
+          <w:tcPr>
+            <w:tcW w:type="dxa" w:w="2041"/>
+          </w:tcPr>
+          <w:p>
+            <w:r/>
+            <w:r>
+              <w:rPr>
+                <w:b w:val="0"/>
+                <w:sz w:val="20"/>
+              </w:rPr>
+              <w:t>Gros lots</w:t>
+            </w:r>
+          </w:p>
+        </w:tc>
+        <w:tc>
+          <w:tcPr>
+            <w:tcW w:type="dxa" w:w="6236"/>
+          </w:tcPr>
+          <w:p>
+            <w:r/>
+            <w:r>
+              <w:rPr>
+                <w:b w:val="0"/>
+                <w:sz w:val="20"/>
+              </w:rPr>
+              <w:t>La génération en arrière-plan affiche sa progression et télécharge le fichier automatiquement à la fin.</w:t>
+            </w:r>
+          </w:p>
+        </w:tc>
+        <w:tc>
+          <w:tcPr>
+            <w:tcW w:type="dxa" w:w="1247"/>
+          </w:tcPr>
+          <w:p>
+            <w:r/>
+            <w:r>
+              <w:rPr>
+                <w:b w:val="0"/>
+                <w:sz w:val="20"/>
+              </w:rPr>
+              <w:t>9.1</w:t>
+            </w:r>
+          </w:p>
+        </w:tc>
+      </w:tr>
+      <w:tr>
+        <w:tc>
+          <w:tcPr>
+            <w:tcW w:type="dxa" w:w="2041"/>
+          </w:tcPr>
+          <w:p>
+            <w:r/>
+            <w:r>
+              <w:rPr>
+                <w:b w:val="0"/>
+                <w:sz w:val="20"/>
+              </w:rPr>
+              <w:t>Amendement</w:t>
+            </w:r>
+          </w:p>
+        </w:tc>
+        <w:tc>
+          <w:tcPr>
+            <w:tcW w:type="dxa" w:w="6236"/>
+          </w:tcPr>
+          <w:p>
+            <w:r/>
+            <w:r>
+              <w:rPr>
+                <w:b w:val="0"/>
+                <w:sz w:val="20"/>
+              </w:rPr>
+              <w:t>Refusé tant qu'un fichier contenant l'OM attend son dépôt.</w:t>
+            </w:r>
+          </w:p>
+        </w:tc>
+        <w:tc>
+          <w:tcPr>
+            <w:tcW w:type="dxa" w:w="1247"/>
+          </w:tcPr>
+          <w:p>
+            <w:r/>
+            <w:r>
+              <w:rPr>
+                <w:b w:val="0"/>
+                <w:sz w:val="20"/>
+              </w:rPr>
+              <w:t>6.3</w:t>
+            </w:r>
+          </w:p>
+        </w:tc>
+      </w:tr>
+      <w:tr>
+        <w:tc>
+          <w:tcPr>
+            <w:tcW w:type="dxa" w:w="2041"/>
+          </w:tcPr>
+          <w:p>
+            <w:r/>
+            <w:r>
+              <w:rPr>
+                <w:b w:val="0"/>
+                <w:sz w:val="20"/>
+              </w:rPr>
+              <w:t>OM sans état de paiement</w:t>
+            </w:r>
+          </w:p>
+        </w:tc>
+        <w:tc>
+          <w:tcPr>
+            <w:tcW w:type="dxa" w:w="6236"/>
+          </w:tcPr>
+          <w:p>
+            <w:r/>
+            <w:r>
+              <w:rPr>
+                <w:b w:val="0"/>
+                <w:sz w:val="20"/>
+              </w:rPr>
+              <w:t>Boutons « Valider » et « Rejeter » sur la fiche de l'OM (reprise de données). Un OM rejeté voit ses versements annulés.</w:t>
+            </w:r>
+          </w:p>
+        </w:tc>
+        <w:tc>
+          <w:tcPr>
+            <w:tcW w:type="dxa" w:w="1247"/>
+          </w:tcPr>
+          <w:p>
+            <w:r/>
+            <w:r>
+              <w:rPr>
+                <w:b w:val="0"/>
+                <w:sz w:val="20"/>
+              </w:rPr>
+              <w:t>6.2</w:t>
+            </w:r>
+          </w:p>
+        </w:tc>
+      </w:tr>
+      <w:tr>
+        <w:tc>
+          <w:tcPr>
+            <w:tcW w:type="dxa" w:w="2041"/>
+          </w:tcPr>
+          <w:p>
+            <w:r/>
+            <w:r>
+              <w:rPr>
+                <w:b w:val="0"/>
+                <w:sz w:val="20"/>
+              </w:rPr>
+              <w:t>Retranscription</w:t>
+            </w:r>
+          </w:p>
+        </w:tc>
+        <w:tc>
+          <w:tcPr>
+            <w:tcW w:type="dxa" w:w="6236"/>
+          </w:tcPr>
+          <w:p>
+            <w:r/>
+            <w:r>
+              <w:rPr>
+                <w:b w:val="0"/>
+                <w:sz w:val="20"/>
+              </w:rPr>
+              <w:t>Un même agent ne peut figurer qu'une fois dans une mission.</w:t>
+            </w:r>
+          </w:p>
+        </w:tc>
+        <w:tc>
+          <w:tcPr>
+            <w:tcW w:type="dxa" w:w="1247"/>
+          </w:tcPr>
+          <w:p>
+            <w:r/>
+            <w:r>
+              <w:rPr>
+                <w:b w:val="0"/>
+                <w:sz w:val="20"/>
+              </w:rPr>
+              <w:t>6.1</w:t>
+            </w:r>
+          </w:p>
+        </w:tc>
+      </w:tr>
+      <w:tr>
+        <w:tc>
+          <w:tcPr>
+            <w:tcW w:type="dxa" w:w="2041"/>
+          </w:tcPr>
+          <w:p>
+            <w:r/>
+            <w:r>
+              <w:rPr>
+                <w:b w:val="0"/>
+                <w:sz w:val="20"/>
+              </w:rPr>
+              <w:t>Per diem</w:t>
+            </w:r>
+          </w:p>
+        </w:tc>
+        <w:tc>
+          <w:tcPr>
+            <w:tcW w:type="dxa" w:w="6236"/>
+          </w:tcPr>
+          <w:p>
+            <w:r/>
+            <w:r>
+              <w:rPr>
+                <w:b w:val="0"/>
+                <w:sz w:val="20"/>
+              </w:rPr>
+              <w:t>Sans jour facturé, le transport reste dû (seule l'exonération met tout à 0).</w:t>
+            </w:r>
+          </w:p>
+        </w:tc>
+        <w:tc>
+          <w:tcPr>
+            <w:tcW w:type="dxa" w:w="1247"/>
+          </w:tcPr>
+          <w:p>
+            <w:r/>
+            <w:r>
+              <w:rPr>
+                <w:b w:val="0"/>
+                <w:sz w:val="20"/>
+              </w:rPr>
+              <w:t>8</w:t>
+            </w:r>
+          </w:p>
+        </w:tc>
+      </w:tr>
+      <w:tr>
+        <w:tc>
+          <w:tcPr>
+            <w:tcW w:type="dxa" w:w="2041"/>
+          </w:tcPr>
+          <w:p>
+            <w:r/>
+            <w:r>
+              <w:rPr>
+                <w:b w:val="0"/>
+                <w:sz w:val="20"/>
+              </w:rPr>
+              <w:t>Liste des OM</w:t>
+            </w:r>
+          </w:p>
+        </w:tc>
+        <w:tc>
+          <w:tcPr>
+            <w:tcW w:type="dxa" w:w="6236"/>
+          </w:tcPr>
+          <w:p>
+            <w:r/>
+            <w:r>
+              <w:rPr>
+                <w:b w:val="0"/>
+                <w:sz w:val="20"/>
+              </w:rPr>
+              <w:t>Le filtre « opérateur » porte sur l'opérateur du paiement.</w:t>
+            </w:r>
+          </w:p>
+        </w:tc>
+        <w:tc>
+          <w:tcPr>
+            <w:tcW w:type="dxa" w:w="1247"/>
+          </w:tcPr>
+          <w:p>
+            <w:r/>
+            <w:r>
+              <w:rPr>
+                <w:b w:val="0"/>
+                <w:sz w:val="20"/>
+              </w:rPr>
+              <w:t>6.2</w:t>
+            </w:r>
+          </w:p>
+        </w:tc>
+      </w:tr>
+      <w:tr>
+        <w:tc>
+          <w:tcPr>
+            <w:tcW w:type="dxa" w:w="2041"/>
+          </w:tcPr>
+          <w:p>
+            <w:r/>
+            <w:r>
+              <w:rPr>
+                <w:b w:val="0"/>
+                <w:sz w:val="20"/>
+              </w:rPr>
+              <w:t>Sauvegardes</w:t>
+            </w:r>
+          </w:p>
+        </w:tc>
+        <w:tc>
+          <w:tcPr>
+            <w:tcW w:type="dxa" w:w="6236"/>
+          </w:tcPr>
+          <w:p>
+            <w:r/>
+            <w:r>
+              <w:rPr>
+                <w:b w:val="0"/>
+                <w:sz w:val="20"/>
+              </w:rPr>
+              <w:t>Téléchargement et restauration d'une sauvegarde, avec sauvegarde de sécurité automatique avant restauration.</w:t>
+            </w:r>
+          </w:p>
+        </w:tc>
+        <w:tc>
+          <w:tcPr>
+            <w:tcW w:type="dxa" w:w="1247"/>
+          </w:tcPr>
+          <w:p>
+            <w:r/>
+            <w:r>
+              <w:rPr>
+                <w:b w:val="0"/>
+                <w:sz w:val="20"/>
+              </w:rPr>
+              <w:t>13.3</w:t>
+            </w:r>
+          </w:p>
+        </w:tc>
+      </w:tr>
+      <w:tr>
+        <w:tc>
+          <w:tcPr>
+            <w:tcW w:type="dxa" w:w="2041"/>
+          </w:tcPr>
+          <w:p>
+            <w:r/>
+            <w:r>
+              <w:rPr>
+                <w:b w:val="0"/>
+                <w:sz w:val="20"/>
+              </w:rPr>
+              <w:t>Droits d'accès</w:t>
+            </w:r>
+          </w:p>
+        </w:tc>
+        <w:tc>
+          <w:tcPr>
+            <w:tcW w:type="dxa" w:w="6236"/>
+          </w:tcPr>
+          <w:p>
+            <w:r/>
+            <w:r>
+              <w:rPr>
+                <w:b w:val="0"/>
+                <w:sz w:val="20"/>
+              </w:rPr>
+              <w:t>La séparation ordonnateur / payeur est aussi vérifiée pour chaque membre d'un profil modifié.</w:t>
+            </w:r>
+          </w:p>
+        </w:tc>
+        <w:tc>
+          <w:tcPr>
+            <w:tcW w:type="dxa" w:w="1247"/>
+          </w:tcPr>
+          <w:p>
+            <w:r/>
+            <w:r>
+              <w:rPr>
+                <w:b w:val="0"/>
+                <w:sz w:val="20"/>
+              </w:rPr>
+              <w:t>2.2</w:t>
+            </w:r>
+          </w:p>
+        </w:tc>
+      </w:tr>
+    </w:tbl>
+    <w:p/>
     <w:p>
       <w:r>
         <w:br w:type="page"/>
@@ -268,6 +875,10 @@
     <w:p>
       <w:pPr>
         <w:pStyle w:val="ListNumber"/>
+        <w:numPr>
+          <w:ilvl w:val="0"/>
+          <w:numId w:val="10"/>
+        </w:numPr>
       </w:pPr>
       <w:r>
         <w:t>SEMO émet les ordres de mission (hors application).</w:t>
@@ -276,6 +887,10 @@
     <w:p>
       <w:pPr>
         <w:pStyle w:val="ListNumber"/>
+        <w:numPr>
+          <w:ilvl w:val="0"/>
+          <w:numId w:val="10"/>
+        </w:numPr>
       </w:pPr>
       <w:r>
         <w:t>Un gestionnaire retranscrit les OM dans l'application, regroupés par mission.</w:t>
@@ -284,6 +899,10 @@
     <w:p>
       <w:pPr>
         <w:pStyle w:val="ListNumber"/>
+        <w:numPr>
+          <w:ilvl w:val="0"/>
+          <w:numId w:val="10"/>
+        </w:numPr>
       </w:pPr>
       <w:r>
         <w:t>Le système calcule le per diem (catégorie × zone × type de prise en charge × nombre de jours).</w:t>
@@ -292,6 +911,10 @@
     <w:p>
       <w:pPr>
         <w:pStyle w:val="ListNumber"/>
+        <w:numPr>
+          <w:ilvl w:val="0"/>
+          <w:numId w:val="10"/>
+        </w:numPr>
       </w:pPr>
       <w:r>
         <w:t>Le gestionnaire établit le récapitulatif de l'ÉTAT DES AVANCES (brouillon).</w:t>
@@ -300,6 +923,10 @@
     <w:p>
       <w:pPr>
         <w:pStyle w:val="ListNumber"/>
+        <w:numPr>
+          <w:ilvl w:val="0"/>
+          <w:numId w:val="10"/>
+        </w:numPr>
       </w:pPr>
       <w:r>
         <w:t>Contrôleur → visa DAF → validation DG sur l'état des avances.</w:t>
@@ -308,6 +935,10 @@
     <w:p>
       <w:pPr>
         <w:pStyle w:val="ListNumber"/>
+        <w:numPr>
+          <w:ilvl w:val="0"/>
+          <w:numId w:val="10"/>
+        </w:numPr>
       </w:pPr>
       <w:r>
         <w:t>La validation du DG arrête l'état des avances, rend les OM VALIDE et ouvre les fichiers d'AVANCE.</w:t>
@@ -316,6 +947,10 @@
     <w:p>
       <w:pPr>
         <w:pStyle w:val="ListNumber"/>
+        <w:numPr>
+          <w:ilvl w:val="0"/>
+          <w:numId w:val="10"/>
+        </w:numPr>
       </w:pPr>
       <w:r>
         <w:t>L'agent financier génère et dépose les fichiers d'avance (.txt MTN / .xlsx Moov), puis les confirme.</w:t>
@@ -324,6 +959,10 @@
     <w:p>
       <w:pPr>
         <w:pStyle w:val="ListNumber"/>
+        <w:numPr>
+          <w:ilvl w:val="0"/>
+          <w:numId w:val="10"/>
+        </w:numPr>
       </w:pPr>
       <w:r>
         <w:t>Une fois l'état des avances validé, le gestionnaire établit l'ÉTAT DES RELIQUATS, qui suit le même circuit.</w:t>
@@ -332,6 +971,10 @@
     <w:p>
       <w:pPr>
         <w:pStyle w:val="ListNumber"/>
+        <w:numPr>
+          <w:ilvl w:val="0"/>
+          <w:numId w:val="10"/>
+        </w:numPr>
       </w:pPr>
       <w:r>
         <w:t>La validation de l'état des reliquats ouvre les fichiers de RELIQUAT, générés, déposés puis confirmés.</w:t>
@@ -433,7 +1076,7 @@
         <w:pStyle w:val="ListBullet"/>
       </w:pPr>
       <w:r>
-        <w:t>Lot de paiement : 1 mission × 1 tranche × 1 opérateur = 1 fichier généré.</w:t>
+        <w:t>Lot de paiement : 1 mission × 1 tranche × 1 opérateur = 1 fichier généré. Un lot « complémentaire » peut s'y ajouter pour les versements devenus payables après sa confirmation.</w:t>
       </w:r>
     </w:p>
     <w:p>
@@ -474,11 +1117,12 @@
         <w:tblStyle w:val="TableGrid"/>
         <w:tblW w:type="auto" w:w="0"/>
         <w:jc w:val="center"/>
+        <w:tblLayout w:type="fixed"/>
         <w:tblLook w:firstColumn="1" w:firstRow="1" w:lastColumn="0" w:lastRow="0" w:noHBand="0" w:noVBand="1" w:val="04A0"/>
       </w:tblPr>
       <w:tblGrid>
-        <w:gridCol w:w="4320"/>
-        <w:gridCol w:w="4320"/>
+        <w:gridCol w:w="2381"/>
+        <w:gridCol w:w="7143"/>
       </w:tblGrid>
       <w:tr>
         <w:tc>
@@ -831,17 +1475,18 @@
         <w:tblStyle w:val="TableGrid"/>
         <w:tblW w:type="auto" w:w="0"/>
         <w:jc w:val="center"/>
+        <w:tblLayout w:type="fixed"/>
         <w:tblLook w:firstColumn="1" w:firstRow="1" w:lastColumn="0" w:lastRow="0" w:noHBand="0" w:noVBand="1" w:val="04A0"/>
       </w:tblPr>
       <w:tblGrid>
-        <w:gridCol w:w="1080"/>
-        <w:gridCol w:w="1080"/>
-        <w:gridCol w:w="1080"/>
-        <w:gridCol w:w="1080"/>
-        <w:gridCol w:w="1080"/>
-        <w:gridCol w:w="1080"/>
-        <w:gridCol w:w="1080"/>
-        <w:gridCol w:w="1080"/>
+        <w:gridCol w:w="2608"/>
+        <w:gridCol w:w="907"/>
+        <w:gridCol w:w="907"/>
+        <w:gridCol w:w="907"/>
+        <w:gridCol w:w="907"/>
+        <w:gridCol w:w="907"/>
+        <w:gridCol w:w="907"/>
+        <w:gridCol w:w="907"/>
       </w:tblGrid>
       <w:tr>
         <w:tc>
@@ -3216,7 +3861,7 @@
               <w:rPr>
                 <w:sz w:val="20"/>
               </w:rPr>
-              <w:t>Le SUPER_ADMIN garde toujours l'accès total et n'est pas modifiable. Certaines clés sensibles (gestion des super admins, des paramètres, de la matrice elle-même) lui restent exclusives. Enfin, la séparation ordonnateur / payeur est vérifiée à chaque modification : un profil ou un compte qui valide l'état (DG) ne peut pas aussi générer ou confirmer les paiements. Toute modification est tracée au journal d'audit.</w:t>
+              <w:t>Le SUPER_ADMIN garde toujours l'accès total et n'est pas modifiable. Certaines clés sensibles (gestion des super admins, des paramètres, de la matrice elle-même) lui restent exclusives. Enfin, la séparation ordonnateur / payeur est vérifiée à chaque modification : un profil ou un compte qui valide l'état (DG) ne peut pas aussi générer ou confirmer les paiements. Cette règle est vérifiée pour chaque membre d'un profil modifié, droits individuels compris : la modification est refusée et les comptes concernés sont nommés. Toute modification est tracée au journal d'audit.</w:t>
             </w:r>
           </w:p>
         </w:tc>
@@ -3251,6 +3896,10 @@
     <w:p>
       <w:pPr>
         <w:pStyle w:val="ListNumber"/>
+        <w:numPr>
+          <w:ilvl w:val="0"/>
+          <w:numId w:val="11"/>
+        </w:numPr>
       </w:pPr>
       <w:r>
         <w:t>Ouvrez l'application dans votre navigateur.</w:t>
@@ -3259,6 +3908,10 @@
     <w:p>
       <w:pPr>
         <w:pStyle w:val="ListNumber"/>
+        <w:numPr>
+          <w:ilvl w:val="0"/>
+          <w:numId w:val="11"/>
+        </w:numPr>
       </w:pPr>
       <w:r>
         <w:t>Saisissez votre adresse e-mail professionnelle et votre mot de passe.</w:t>
@@ -3267,6 +3920,10 @@
     <w:p>
       <w:pPr>
         <w:pStyle w:val="ListNumber"/>
+        <w:numPr>
+          <w:ilvl w:val="0"/>
+          <w:numId w:val="11"/>
+        </w:numPr>
       </w:pPr>
       <w:r>
         <w:t>Cliquez sur « Se connecter ». Vous arrivez sur le tableau de bord.</w:t>
@@ -3318,6 +3975,10 @@
     <w:p>
       <w:pPr>
         <w:pStyle w:val="ListNumber"/>
+        <w:numPr>
+          <w:ilvl w:val="0"/>
+          <w:numId w:val="12"/>
+        </w:numPr>
       </w:pPr>
       <w:r>
         <w:t>Sur l'écran de connexion, cliquez sur « Mot de passe oublié ? ».</w:t>
@@ -3326,6 +3987,10 @@
     <w:p>
       <w:pPr>
         <w:pStyle w:val="ListNumber"/>
+        <w:numPr>
+          <w:ilvl w:val="0"/>
+          <w:numId w:val="12"/>
+        </w:numPr>
       </w:pPr>
       <w:r>
         <w:t>Saisissez votre e-mail. Un lien de réinitialisation vous est envoyé (si le compte existe).</w:t>
@@ -3334,6 +3999,10 @@
     <w:p>
       <w:pPr>
         <w:pStyle w:val="ListNumber"/>
+        <w:numPr>
+          <w:ilvl w:val="0"/>
+          <w:numId w:val="12"/>
+        </w:numPr>
       </w:pPr>
       <w:r>
         <w:t>Suivez le lien reçu, puis définissez un nouveau mot de passe.</w:t>
@@ -3359,6 +4028,10 @@
     <w:p>
       <w:pPr>
         <w:pStyle w:val="ListNumber"/>
+        <w:numPr>
+          <w:ilvl w:val="0"/>
+          <w:numId w:val="13"/>
+        </w:numPr>
       </w:pPr>
       <w:r>
         <w:t>Saisissez votre mot de passe actuel (temporaire).</w:t>
@@ -3367,6 +4040,10 @@
     <w:p>
       <w:pPr>
         <w:pStyle w:val="ListNumber"/>
+        <w:numPr>
+          <w:ilvl w:val="0"/>
+          <w:numId w:val="13"/>
+        </w:numPr>
       </w:pPr>
       <w:r>
         <w:t>Choisissez un nouveau mot de passe : au moins 12 caractères, avec majuscules, minuscules, chiffres et symboles.</w:t>
@@ -3375,6 +4052,10 @@
     <w:p>
       <w:pPr>
         <w:pStyle w:val="ListNumber"/>
+        <w:numPr>
+          <w:ilvl w:val="0"/>
+          <w:numId w:val="13"/>
+        </w:numPr>
       </w:pPr>
       <w:r>
         <w:t>Confirmez. Vous accédez ensuite normalement à l'application.</w:t>
@@ -3435,7 +4116,7 @@
         <w:pStyle w:val="ListBullet"/>
       </w:pPr>
       <w:r>
-        <w:t>Filtres par catégorie (ORDRE_1/2/3), par opérateur et par statut actif/inactif.</w:t>
+        <w:t>Filtres par catégorie d'indice (≥ 800 / 400-799 / &lt; 400), par opérateur et par statut actif/inactif.</w:t>
       </w:r>
     </w:p>
     <w:p>
@@ -3466,6 +4147,10 @@
     <w:p>
       <w:pPr>
         <w:pStyle w:val="ListNumber"/>
+        <w:numPr>
+          <w:ilvl w:val="0"/>
+          <w:numId w:val="14"/>
+        </w:numPr>
       </w:pPr>
       <w:r>
         <w:t>Cliquez sur « Nouvel agent » (ou « Modifier » depuis une fiche).</w:t>
@@ -3474,6 +4159,10 @@
     <w:p>
       <w:pPr>
         <w:pStyle w:val="ListNumber"/>
+        <w:numPr>
+          <w:ilvl w:val="0"/>
+          <w:numId w:val="14"/>
+        </w:numPr>
       </w:pPr>
       <w:r>
         <w:t>Renseignez l'identité, le matricule, l'indice ou le salaire brut (la catégorie en est déduite).</w:t>
@@ -3482,6 +4171,10 @@
     <w:p>
       <w:pPr>
         <w:pStyle w:val="ListNumber"/>
+        <w:numPr>
+          <w:ilvl w:val="0"/>
+          <w:numId w:val="14"/>
+        </w:numPr>
       </w:pPr>
       <w:r>
         <w:t>Saisissez le téléphone (10 chiffres, commençant par 01) et l'opérateur cohérent avec le numéro.</w:t>
@@ -3490,9 +4183,13 @@
     <w:p>
       <w:pPr>
         <w:pStyle w:val="ListNumber"/>
+        <w:numPr>
+          <w:ilvl w:val="0"/>
+          <w:numId w:val="14"/>
+        </w:numPr>
       </w:pPr>
       <w:r>
-        <w:t>Enregistrez. La catégorie ORDRE_1/2/3 est calculée automatiquement.</w:t>
+        <w:t>Enregistrez. La catégorie d'indice (≥ 800 / 400-799 / &lt; 400) est calculée automatiquement.</w:t>
       </w:r>
     </w:p>
     <w:p>
@@ -3506,6 +4203,10 @@
     <w:p>
       <w:pPr>
         <w:pStyle w:val="ListNumber"/>
+        <w:numPr>
+          <w:ilvl w:val="0"/>
+          <w:numId w:val="15"/>
+        </w:numPr>
       </w:pPr>
       <w:r>
         <w:t>Ouvrez « Import » dans le module Personnel.</w:t>
@@ -3514,6 +4215,10 @@
     <w:p>
       <w:pPr>
         <w:pStyle w:val="ListNumber"/>
+        <w:numPr>
+          <w:ilvl w:val="0"/>
+          <w:numId w:val="15"/>
+        </w:numPr>
       </w:pPr>
       <w:r>
         <w:t>Déposez votre fichier Excel/CSV et lancez la prévisualisation.</w:t>
@@ -3522,6 +4227,10 @@
     <w:p>
       <w:pPr>
         <w:pStyle w:val="ListNumber"/>
+        <w:numPr>
+          <w:ilvl w:val="0"/>
+          <w:numId w:val="15"/>
+        </w:numPr>
       </w:pPr>
       <w:r>
         <w:t>Consultez le rapport de contrôle : chaque ligne est vérifiée (unicité du matricule et du téléphone, cohérence numéro/opérateur).</w:t>
@@ -3530,6 +4239,10 @@
     <w:p>
       <w:pPr>
         <w:pStyle w:val="ListNumber"/>
+        <w:numPr>
+          <w:ilvl w:val="0"/>
+          <w:numId w:val="15"/>
+        </w:numPr>
       </w:pPr>
       <w:r>
         <w:t>Validez l'import.</w:t>
@@ -3678,6 +4391,14 @@
     </w:p>
     <w:p>
       <w:pPr>
+        <w:pStyle w:val="ListBullet"/>
+      </w:pPr>
+      <w:r>
+        <w:t>Un même agent ne peut figurer qu'une fois dans une mission : un OM par bénéficiaire.</w:t>
+      </w:r>
+    </w:p>
+    <w:p>
+      <w:pPr>
         <w:pStyle w:val="Heading3"/>
       </w:pPr>
       <w:r>
@@ -3714,7 +4435,7 @@
         <w:pStyle w:val="ListBullet"/>
       </w:pPr>
       <w:r>
-        <w:t>Liste filtrable par statut, zone, opérateur, agent, dates ; recherche par référence SEMO.</w:t>
+        <w:t>Liste filtrable par statut, zone, opérateur, agent, dates ; recherche par référence SEMO. Le filtre « opérateur » porte sur l'opérateur du paiement (celui des versements), même si l'agent a changé d'opérateur depuis.</w:t>
       </w:r>
     </w:p>
     <w:p>
@@ -3747,9 +4468,44 @@
           <w:b w:val="0"/>
           <w:i w:val="0"/>
         </w:rPr>
-        <w:t>La validation des ordres de mission ne se fait pas un par un : elle se joue sur l'état de paiement de la mission (chapitre 7). Le présent chapitre s'arrête donc à la retranscription et à la consultation.</w:t>
+        <w:t>La validation des ordres de mission ne se fait pas un par un : elle se joue sur l'état de paiement de la mission (chapitre 7).</w:t>
       </w:r>
     </w:p>
+    <w:tbl>
+      <w:tblPr>
+        <w:tblW w:type="auto" w:w="0"/>
+        <w:jc w:val="center"/>
+        <w:tblLook w:firstColumn="1" w:firstRow="1" w:lastColumn="0" w:lastRow="0" w:noHBand="0" w:noVBand="1" w:val="04A0"/>
+      </w:tblPr>
+      <w:tblGrid>
+        <w:gridCol w:w="8640"/>
+      </w:tblGrid>
+      <w:tr>
+        <w:tc>
+          <w:tcPr>
+            <w:tcW w:type="dxa" w:w="9524"/>
+            <w:shd w:val="clear" w:fill="EDFAF2"/>
+          </w:tcPr>
+          <w:p>
+            <w:r>
+              <w:rPr>
+                <w:b/>
+                <w:color w:val="0A3D1F"/>
+                <w:sz w:val="20"/>
+              </w:rPr>
+              <w:t xml:space="preserve">Exception : mission sans état de paiement (reprise de données) : </w:t>
+            </w:r>
+            <w:r>
+              <w:rPr>
+                <w:sz w:val="20"/>
+              </w:rPr>
+              <w:t>Pour une mission dont aucun état de paiement n'a été établi, la fiche d'un OM au statut IMPORTE propose les boutons « Valider » (CONTROLEUR) et « Rejeter » (motif d'au moins 10 caractères). Dès qu'un état existe pour la mission, ces boutons disparaissent : la validation passe alors obligatoirement par l'état. Un OM rejeté voit ses versements en attente ANNULÉS : il ne sera jamais payé.</w:t>
+            </w:r>
+          </w:p>
+        </w:tc>
+      </w:tr>
+    </w:tbl>
+    <w:p/>
     <w:p>
       <w:pPr>
         <w:pStyle w:val="Heading2"/>
@@ -3770,6 +4526,10 @@
     <w:p>
       <w:pPr>
         <w:pStyle w:val="ListNumber"/>
+        <w:numPr>
+          <w:ilvl w:val="0"/>
+          <w:numId w:val="16"/>
+        </w:numPr>
       </w:pPr>
       <w:r>
         <w:t>Depuis la fiche de l'OM, cliquez sur « Amender ».</w:t>
@@ -3778,6 +4538,10 @@
     <w:p>
       <w:pPr>
         <w:pStyle w:val="ListNumber"/>
+        <w:numPr>
+          <w:ilvl w:val="0"/>
+          <w:numId w:val="16"/>
+        </w:numPr>
       </w:pPr>
       <w:r>
         <w:t>Saisissez le nouveau nombre de jours (ou la nouvelle répartition) et un motif obligatoire (≥ 10 caractères).</w:t>
@@ -3786,6 +4550,10 @@
     <w:p>
       <w:pPr>
         <w:pStyle w:val="ListNumber"/>
+        <w:numPr>
+          <w:ilvl w:val="0"/>
+          <w:numId w:val="16"/>
+        </w:numPr>
       </w:pPr>
       <w:r>
         <w:t>Validez : le nouveau montant total est recalculé et le reliquat ajusté.</w:t>
@@ -3840,6 +4608,22 @@
       </w:pPr>
       <w:r>
         <w:t>L'amendement est refusé si l'OM est rejeté ou annulé, si un état de tranche est en cours de signature (contrôle / visa en cours), si l'état des reliquats est déjà validé, ou si un trop-perçu de l'OM a déjà été recouvré.</w:t>
+      </w:r>
+    </w:p>
+    <w:p>
+      <w:pPr>
+        <w:pStyle w:val="ListBullet"/>
+      </w:pPr>
+      <w:r>
+        <w:t>Il est aussi refusé tant qu'un fichier de paiement contenant l'OM attend son dépôt (lot GÉNÉRÉ) : confirmez d'abord le lot, ou signalez-le en erreur, puis amendez.</w:t>
+      </w:r>
+    </w:p>
+    <w:p>
+      <w:pPr>
+        <w:pStyle w:val="ListBullet"/>
+      </w:pPr>
+      <w:r>
+        <w:t>Mission sans état de paiement : si l'avance a déjà été confirmée, elle est figée au moment de l'amendement, exactement comme après la validation d'un état des avances.</w:t>
       </w:r>
     </w:p>
     <w:p>
@@ -3965,13 +4749,14 @@
         <w:tblStyle w:val="TableGrid"/>
         <w:tblW w:type="auto" w:w="0"/>
         <w:jc w:val="center"/>
+        <w:tblLayout w:type="fixed"/>
         <w:tblLook w:firstColumn="1" w:firstRow="1" w:lastColumn="0" w:lastRow="0" w:noHBand="0" w:noVBand="1" w:val="04A0"/>
       </w:tblPr>
       <w:tblGrid>
-        <w:gridCol w:w="2160"/>
-        <w:gridCol w:w="2160"/>
-        <w:gridCol w:w="2160"/>
-        <w:gridCol w:w="2160"/>
+        <w:gridCol w:w="907"/>
+        <w:gridCol w:w="1814"/>
+        <w:gridCol w:w="4535"/>
+        <w:gridCol w:w="2268"/>
       </w:tblGrid>
       <w:tr>
         <w:tc>
@@ -4323,6 +5108,41 @@
         <w:t>Il existe donc deux documents définitifs : l'état des avances et l'état des reliquats.</w:t>
       </w:r>
     </w:p>
+    <w:tbl>
+      <w:tblPr>
+        <w:tblW w:type="auto" w:w="0"/>
+        <w:jc w:val="center"/>
+        <w:tblLook w:firstColumn="1" w:firstRow="1" w:lastColumn="0" w:lastRow="0" w:noHBand="0" w:noVBand="1" w:val="04A0"/>
+      </w:tblPr>
+      <w:tblGrid>
+        <w:gridCol w:w="8640"/>
+      </w:tblGrid>
+      <w:tr>
+        <w:tc>
+          <w:tcPr>
+            <w:tcW w:type="dxa" w:w="9524"/>
+            <w:shd w:val="clear" w:fill="EDFAF2"/>
+          </w:tcPr>
+          <w:p>
+            <w:r>
+              <w:rPr>
+                <w:b/>
+                <w:color w:val="0A3D1F"/>
+                <w:sz w:val="20"/>
+              </w:rPr>
+              <w:t xml:space="preserve">L'état des reliquats porte le montant réellement payé : </w:t>
+            </w:r>
+            <w:r>
+              <w:rPr>
+                <w:sz w:val="20"/>
+              </w:rPr>
+              <w:t>Le total de l'état des reliquats est la somme des reliquats POSITIFS : c'est exactement ce que les fichiers de paiement verseront. Un trop-perçu (reliquat négatif après amendement) ne diminue pas ce total ; il apparaît sur la ligne du bénéficiaire et dans une mention distincte « trop-perçus hors total, à recouvrer par retenue sur salaire » (voir chapitre 9.5).</w:t>
+            </w:r>
+          </w:p>
+        </w:tc>
+      </w:tr>
+    </w:tbl>
+    <w:p/>
     <w:p>
       <w:pPr>
         <w:pStyle w:val="ListBullet"/>
@@ -4430,7 +5250,7 @@
         <w:pStyle w:val="ListBullet"/>
       </w:pPr>
       <w:r>
-        <w:t>Transport : montant facultatif ajouté au total avant la répartition avance / reliquat.</w:t>
+        <w:t>Transport : montant facultatif ajouté au total avant la répartition avance / reliquat. Il reste dû même si aucun jour n'est facturé (per diem à 0).</w:t>
       </w:r>
     </w:p>
     <w:p>
@@ -4454,7 +5274,7 @@
         <w:pStyle w:val="ListBullet"/>
       </w:pPr>
       <w:r>
-        <w:t>Exonération (prise en charge par un tiers) : tous les montants sont à 0, aucun versement n'est créé.</w:t>
+        <w:t>Exonération (prise en charge par un tiers) : tous les montants sont à 0, transport compris, et aucun versement n'est créé.</w:t>
       </w:r>
     </w:p>
     <w:p>
@@ -4529,6 +5349,10 @@
     <w:p>
       <w:pPr>
         <w:pStyle w:val="ListNumber"/>
+        <w:numPr>
+          <w:ilvl w:val="0"/>
+          <w:numId w:val="17"/>
+        </w:numPr>
       </w:pPr>
       <w:r>
         <w:t>Ouvrez « Paiements MTN » ou « Paiements Moov ».</w:t>
@@ -4537,6 +5361,10 @@
     <w:p>
       <w:pPr>
         <w:pStyle w:val="ListNumber"/>
+        <w:numPr>
+          <w:ilvl w:val="0"/>
+          <w:numId w:val="17"/>
+        </w:numPr>
       </w:pPr>
       <w:r>
         <w:t>Sélectionnez la mission, la tranche (AVANCE ou RELIQUAT) et l'opérateur.</w:t>
@@ -4545,6 +5373,10 @@
     <w:p>
       <w:pPr>
         <w:pStyle w:val="ListNumber"/>
+        <w:numPr>
+          <w:ilvl w:val="0"/>
+          <w:numId w:val="17"/>
+        </w:numPr>
       </w:pPr>
       <w:r>
         <w:t>Cliquez sur « Prévisualiser » : la liste des bénéficiaires éligibles s'affiche.</w:t>
@@ -4553,6 +5385,10 @@
     <w:p>
       <w:pPr>
         <w:pStyle w:val="ListNumber"/>
+        <w:numPr>
+          <w:ilvl w:val="0"/>
+          <w:numId w:val="17"/>
+        </w:numPr>
       </w:pPr>
       <w:r>
         <w:t>Cliquez sur « Générer » : le fichier (.txt pour MTN, .xlsx pour Moov) est téléchargé. Le lot passe au statut GÉNÉRÉ.</w:t>
@@ -4564,7 +5400,7 @@
           <w:b w:val="0"/>
           <w:i w:val="0"/>
         </w:rPr>
-        <w:t>Pour un volume important, la génération se fait en arrière-plan ; un suivi vous informe lorsque le fichier est prêt.</w:t>
+        <w:t>Pour un volume important (plus de 50 bénéficiaires), la génération se fait en arrière-plan : une barre de progression s'affiche et le fichier se télécharge automatiquement dès qu'il est prêt. Restez sur l'écran pendant le traitement ; le lot reste ensuite re-téléchargeable depuis la liste des lots.</w:t>
       </w:r>
     </w:p>
     <w:p>
@@ -4578,6 +5414,10 @@
     <w:p>
       <w:pPr>
         <w:pStyle w:val="ListNumber"/>
+        <w:numPr>
+          <w:ilvl w:val="0"/>
+          <w:numId w:val="18"/>
+        </w:numPr>
       </w:pPr>
       <w:r>
         <w:t>Déposez le fichier généré sur la plateforme de l'opérateur (hors application).</w:t>
@@ -4586,6 +5426,10 @@
     <w:p>
       <w:pPr>
         <w:pStyle w:val="ListNumber"/>
+        <w:numPr>
+          <w:ilvl w:val="0"/>
+          <w:numId w:val="18"/>
+        </w:numPr>
       </w:pPr>
       <w:r>
         <w:t>Une fois le dépôt réussi, revenez dans l'application et cliquez sur « Confirmer » pour le lot.</w:t>
@@ -4594,6 +5438,10 @@
     <w:p>
       <w:pPr>
         <w:pStyle w:val="ListNumber"/>
+        <w:numPr>
+          <w:ilvl w:val="0"/>
+          <w:numId w:val="18"/>
+        </w:numPr>
       </w:pPr>
       <w:r>
         <w:t>Le lot et ses versements passent au statut CONFIRMÉ et sont horodatés. L'OM dont tous les versements sont confirmés passe au statut SOLDÉ.</w:t>
@@ -4620,7 +5468,7 @@
         <w:pStyle w:val="ListBullet"/>
       </w:pPr>
       <w:r>
-        <w:t>En cas de problème de dépôt, marquez le lot « en erreur » : cela réautorise une nouvelle génération.</w:t>
+        <w:t>En cas de problème de dépôt, marquez le lot « en erreur » : cela réautorise une nouvelle génération. Ses versements redeviennent EN ATTENTE et reprennent le téléphone et l'opérateur ACTUELS de l'agent : si le dépôt a échoué à cause d'un mauvais numéro, corrigez la fiche de l'agent, puis régénérez.</w:t>
       </w:r>
     </w:p>
     <w:p>
@@ -4631,6 +5479,41 @@
         <w:t>Seul un lot au statut GÉNÉRÉ peut être confirmé : un lot en erreur doit d'abord être régénéré (on ne confirme jamais un fichier invalidé), et un lot confirmé est définitif.</w:t>
       </w:r>
     </w:p>
+    <w:tbl>
+      <w:tblPr>
+        <w:tblW w:type="auto" w:w="0"/>
+        <w:jc w:val="center"/>
+        <w:tblLook w:firstColumn="1" w:firstRow="1" w:lastColumn="0" w:lastRow="0" w:noHBand="0" w:noVBand="1" w:val="04A0"/>
+      </w:tblPr>
+      <w:tblGrid>
+        <w:gridCol w:w="8640"/>
+      </w:tblGrid>
+      <w:tr>
+        <w:tc>
+          <w:tcPr>
+            <w:tcW w:type="dxa" w:w="9524"/>
+            <w:shd w:val="clear" w:fill="EDFAF2"/>
+          </w:tcPr>
+          <w:p>
+            <w:r>
+              <w:rPr>
+                <w:b/>
+                <w:color w:val="0A3D1F"/>
+                <w:sz w:val="20"/>
+              </w:rPr>
+              <w:t xml:space="preserve">Lots complémentaires : </w:t>
+            </w:r>
+            <w:r>
+              <w:rPr>
+                <w:sz w:val="20"/>
+              </w:rPr>
+              <w:t>Un lot confirmé n'est jamais réécrit. Si un versement devient payable après coup (OM validé plus tard, agent passé d'un opérateur à l'autre, reliquat redevenu positif…), une nouvelle génération crée un lot COMPLÉMENTAIRE qui ne contient que ces nouveaux bénéficiaires. Il est signalé par un badge « complémentaire n° 2, 3… » dans la liste des lots et son fichier porte le suffixe « _COMPL2 », « _COMPL3 »… Il se dépose et se confirme comme un lot ordinaire.</w:t>
+            </w:r>
+          </w:p>
+        </w:tc>
+      </w:tr>
+    </w:tbl>
+    <w:p/>
     <w:p>
       <w:pPr>
         <w:pStyle w:val="Heading2"/>
@@ -4691,6 +5574,10 @@
     <w:p>
       <w:pPr>
         <w:pStyle w:val="ListNumber"/>
+        <w:numPr>
+          <w:ilvl w:val="0"/>
+          <w:numId w:val="19"/>
+        </w:numPr>
       </w:pPr>
       <w:r>
         <w:t>Ouvrez « Régularisations » : la liste des trop-perçus (à recouvrer / recouvrés) s'affiche, filtrable et paginée.</w:t>
@@ -4699,6 +5586,10 @@
     <w:p>
       <w:pPr>
         <w:pStyle w:val="ListNumber"/>
+        <w:numPr>
+          <w:ilvl w:val="0"/>
+          <w:numId w:val="19"/>
+        </w:numPr>
       </w:pPr>
       <w:r>
         <w:t>Téléchargez le « document de retenue sur salaire » (PDF) à remettre à la RH ; il porte le montant à retenir, en chiffres et en toutes lettres.</w:t>
@@ -4707,6 +5598,10 @@
     <w:p>
       <w:pPr>
         <w:pStyle w:val="ListNumber"/>
+        <w:numPr>
+          <w:ilvl w:val="0"/>
+          <w:numId w:val="19"/>
+        </w:numPr>
       </w:pPr>
       <w:r>
         <w:t>Une fois la retenue appliquée par la RH, cliquez sur « Constater le recouvrement » : le versement passe au statut RECOUVRÉ.</w:t>
@@ -4734,7 +5629,7 @@
         <w:pStyle w:val="ListBullet"/>
       </w:pPr>
       <w:r>
-        <w:t>Consultation : accessible à tous les profils internes (« Barème — consulter »).</w:t>
+        <w:t>Consultation : profils disposant de « Barème — consulter » (tous sauf le LECTEUR, par défaut).</w:t>
       </w:r>
     </w:p>
     <w:p>
@@ -4989,9 +5884,113 @@
         <w:pStyle w:val="ListBullet"/>
       </w:pPr>
       <w:r>
-        <w:t>Sauvegardes : création et gestion des sauvegardes de la base de données.</w:t>
+        <w:t>Sauvegardes : création, téléchargement, restauration et suppression des sauvegardes de la base de données (voir chapitre 13.3).</w:t>
       </w:r>
     </w:p>
+    <w:p>
+      <w:pPr>
+        <w:pStyle w:val="Heading2"/>
+      </w:pPr>
+      <w:r>
+        <w:t>13.3 Sauvegardes et restauration</w:t>
+      </w:r>
+    </w:p>
+    <w:p>
+      <w:r>
+        <w:rPr>
+          <w:b w:val="0"/>
+          <w:i w:val="0"/>
+        </w:rPr>
+        <w:t>Réservé au SUPER_ADMIN, écran « Sauvegardes ». Une sauvegarde automatique est faite chaque nuit (02:00) par le serveur ; le bouton « Nouvelle sauvegarde » en crée une immédiatement.</w:t>
+      </w:r>
+    </w:p>
+    <w:p>
+      <w:pPr>
+        <w:pStyle w:val="ListBullet"/>
+      </w:pPr>
+      <w:r>
+        <w:t>Télécharger : survolez une sauvegarde et cliquez sur l'icône de téléchargement pour en garder une copie hors du serveur.</w:t>
+      </w:r>
+    </w:p>
+    <w:p>
+      <w:pPr>
+        <w:pStyle w:val="Heading3"/>
+      </w:pPr>
+      <w:r>
+        <w:t>Restaurer une sauvegarde</w:t>
+      </w:r>
+    </w:p>
+    <w:p>
+      <w:pPr>
+        <w:pStyle w:val="ListNumber"/>
+        <w:numPr>
+          <w:ilvl w:val="0"/>
+          <w:numId w:val="20"/>
+        </w:numPr>
+      </w:pPr>
+      <w:r>
+        <w:t>Survolez la sauvegarde voulue et cliquez sur l'icône « Restaurer ».</w:t>
+      </w:r>
+    </w:p>
+    <w:p>
+      <w:pPr>
+        <w:pStyle w:val="ListNumber"/>
+        <w:numPr>
+          <w:ilvl w:val="0"/>
+          <w:numId w:val="20"/>
+        </w:numPr>
+      </w:pPr>
+      <w:r>
+        <w:t>Lisez l'avertissement : la base actuelle sera entièrement remplacée.</w:t>
+      </w:r>
+    </w:p>
+    <w:p>
+      <w:pPr>
+        <w:pStyle w:val="ListNumber"/>
+        <w:numPr>
+          <w:ilvl w:val="0"/>
+          <w:numId w:val="20"/>
+        </w:numPr>
+      </w:pPr>
+      <w:r>
+        <w:t>Recopiez exactement le nom du fichier pour confirmer, puis cliquez sur « Restaurer ».</w:t>
+      </w:r>
+    </w:p>
+    <w:tbl>
+      <w:tblPr>
+        <w:tblW w:type="auto" w:w="0"/>
+        <w:jc w:val="center"/>
+        <w:tblLook w:firstColumn="1" w:firstRow="1" w:lastColumn="0" w:lastRow="0" w:noHBand="0" w:noVBand="1" w:val="04A0"/>
+      </w:tblPr>
+      <w:tblGrid>
+        <w:gridCol w:w="8640"/>
+      </w:tblGrid>
+      <w:tr>
+        <w:tc>
+          <w:tcPr>
+            <w:tcW w:type="dxa" w:w="9524"/>
+            <w:shd w:val="clear" w:fill="EDFAF2"/>
+          </w:tcPr>
+          <w:p>
+            <w:r>
+              <w:rPr>
+                <w:b/>
+                <w:color w:val="0A3D1F"/>
+                <w:sz w:val="20"/>
+              </w:rPr>
+              <w:t xml:space="preserve">Une restauration se défait : </w:t>
+            </w:r>
+            <w:r>
+              <w:rPr>
+                <w:sz w:val="20"/>
+              </w:rPr>
+              <w:t>Juste avant d'écraser la base, l'application crée automatiquement une sauvegarde de l'état courant. En cas d'erreur, il suffit de restaurer cette sauvegarde de sécurité, la plus récente de la liste. Toutes les données saisies après la date de la sauvegarde restaurée sont perdues : prévenez les utilisateurs et choisissez un moment sans activité. L'opération est tracée au journal d'audit.</w:t>
+            </w:r>
+          </w:p>
+        </w:tc>
+      </w:tr>
+    </w:tbl>
+    <w:p/>
     <w:p>
       <w:r>
         <w:br w:type="page"/>
@@ -5018,11 +6017,12 @@
         <w:tblStyle w:val="TableGrid"/>
         <w:tblW w:type="auto" w:w="0"/>
         <w:jc w:val="center"/>
+        <w:tblLayout w:type="fixed"/>
         <w:tblLook w:firstColumn="1" w:firstRow="1" w:lastColumn="0" w:lastRow="0" w:noHBand="0" w:noVBand="1" w:val="04A0"/>
       </w:tblPr>
       <w:tblGrid>
-        <w:gridCol w:w="4320"/>
-        <w:gridCol w:w="4320"/>
+        <w:gridCol w:w="2268"/>
+        <w:gridCol w:w="7257"/>
       </w:tblGrid>
       <w:tr>
         <w:tc>
@@ -5235,11 +6235,12 @@
         <w:tblStyle w:val="TableGrid"/>
         <w:tblW w:type="auto" w:w="0"/>
         <w:jc w:val="center"/>
+        <w:tblLayout w:type="fixed"/>
         <w:tblLook w:firstColumn="1" w:firstRow="1" w:lastColumn="0" w:lastRow="0" w:noHBand="0" w:noVBand="1" w:val="04A0"/>
       </w:tblPr>
       <w:tblGrid>
-        <w:gridCol w:w="4320"/>
-        <w:gridCol w:w="4320"/>
+        <w:gridCol w:w="2268"/>
+        <w:gridCol w:w="7257"/>
       </w:tblGrid>
       <w:tr>
         <w:tc>
@@ -5400,7 +6401,7 @@
                 <w:b w:val="0"/>
                 <w:sz w:val="20"/>
               </w:rPr>
-              <w:t>Rejeté individuellement (reprise de données ; motif requis).</w:t>
+              <w:t>Rejeté individuellement (reprise de données ; motif requis) ; ses versements sont annulés.</w:t>
             </w:r>
           </w:p>
         </w:tc>
@@ -5452,11 +6453,12 @@
         <w:tblStyle w:val="TableGrid"/>
         <w:tblW w:type="auto" w:w="0"/>
         <w:jc w:val="center"/>
+        <w:tblLayout w:type="fixed"/>
         <w:tblLook w:firstColumn="1" w:firstRow="1" w:lastColumn="0" w:lastRow="0" w:noHBand="0" w:noVBand="1" w:val="04A0"/>
       </w:tblPr>
       <w:tblGrid>
-        <w:gridCol w:w="4320"/>
-        <w:gridCol w:w="4320"/>
+        <w:gridCol w:w="2268"/>
+        <w:gridCol w:w="7257"/>
       </w:tblGrid>
       <w:tr>
         <w:tc>
@@ -5586,6 +6588,38 @@
                 <w:sz w:val="20"/>
               </w:rPr>
               <w:t>Paiement confirmé après dépôt.</w:t>
+            </w:r>
+          </w:p>
+        </w:tc>
+      </w:tr>
+      <w:tr>
+        <w:tc>
+          <w:tcPr>
+            <w:tcW w:type="dxa" w:w="2268"/>
+          </w:tcPr>
+          <w:p>
+            <w:r/>
+            <w:r>
+              <w:rPr>
+                <w:b w:val="0"/>
+                <w:sz w:val="20"/>
+              </w:rPr>
+              <w:t>ANNULE</w:t>
+            </w:r>
+          </w:p>
+        </w:tc>
+        <w:tc>
+          <w:tcPr>
+            <w:tcW w:type="dxa" w:w="7257"/>
+          </w:tcPr>
+          <w:p>
+            <w:r/>
+            <w:r>
+              <w:rPr>
+                <w:b w:val="0"/>
+                <w:sz w:val="20"/>
+              </w:rPr>
+              <w:t>Versement d'un OM rejeté : ne sera jamais payé.</w:t>
             </w:r>
           </w:p>
         </w:tc>
@@ -5662,6 +6696,16 @@
       </w:pPr>
       <w:r>
         <w:t>Lot de paiement</w:t>
+      </w:r>
+    </w:p>
+    <w:p>
+      <w:r>
+        <w:rPr>
+          <w:b w:val="0"/>
+          <w:i/>
+          <w:color w:val="4B5563"/>
+        </w:rPr>
+        <w:t>Un lot porte aussi un numéro de séquence : 1 pour le lot initial, 2, 3… pour les lots complémentaires créés après la confirmation du précédent.</w:t>
       </w:r>
     </w:p>
     <w:tbl>
@@ -5669,11 +6713,12 @@
         <w:tblStyle w:val="TableGrid"/>
         <w:tblW w:type="auto" w:w="0"/>
         <w:jc w:val="center"/>
+        <w:tblLayout w:type="fixed"/>
         <w:tblLook w:firstColumn="1" w:firstRow="1" w:lastColumn="0" w:lastRow="0" w:noHBand="0" w:noVBand="1" w:val="04A0"/>
       </w:tblPr>
       <w:tblGrid>
-        <w:gridCol w:w="4320"/>
-        <w:gridCol w:w="4320"/>
+        <w:gridCol w:w="2268"/>
+        <w:gridCol w:w="7257"/>
       </w:tblGrid>
       <w:tr>
         <w:tc>
@@ -5802,7 +6847,7 @@
                 <w:b w:val="0"/>
                 <w:sz w:val="20"/>
               </w:rPr>
-              <w:t>Signalé en erreur — régénération autorisée.</w:t>
+              <w:t>Signalé en erreur — versements remis en attente, régénération autorisée.</w:t>
             </w:r>
           </w:p>
         </w:tc>
@@ -5835,13 +6880,14 @@
         <w:tblStyle w:val="TableGrid"/>
         <w:tblW w:type="auto" w:w="0"/>
         <w:jc w:val="center"/>
+        <w:tblLayout w:type="fixed"/>
         <w:tblLook w:firstColumn="1" w:firstRow="1" w:lastColumn="0" w:lastRow="0" w:noHBand="0" w:noVBand="1" w:val="04A0"/>
       </w:tblPr>
       <w:tblGrid>
-        <w:gridCol w:w="2160"/>
-        <w:gridCol w:w="2160"/>
-        <w:gridCol w:w="2160"/>
-        <w:gridCol w:w="2160"/>
+        <w:gridCol w:w="2381"/>
+        <w:gridCol w:w="2381"/>
+        <w:gridCol w:w="2381"/>
+        <w:gridCol w:w="2381"/>
       </w:tblGrid>
       <w:tr>
         <w:tc>
@@ -5925,7 +6971,7 @@
                 <w:b w:val="0"/>
                 <w:sz w:val="20"/>
               </w:rPr>
-              <w:t>ORDRE_1</w:t>
+              <w:t>INDICE_SUP_800</w:t>
             </w:r>
           </w:p>
         </w:tc>
@@ -5987,7 +7033,7 @@
                 <w:b w:val="0"/>
                 <w:sz w:val="20"/>
               </w:rPr>
-              <w:t>ORDRE_2</w:t>
+              <w:t>INDICE_400_799</w:t>
             </w:r>
           </w:p>
         </w:tc>
@@ -6049,7 +7095,7 @@
                 <w:b w:val="0"/>
                 <w:sz w:val="20"/>
               </w:rPr>
-              <w:t>ORDRE_3</w:t>
+              <w:t>INDICE_INF_400</w:t>
             </w:r>
           </w:p>
         </w:tc>
@@ -6114,14 +7160,15 @@
         <w:tblStyle w:val="TableGrid"/>
         <w:tblW w:type="auto" w:w="0"/>
         <w:jc w:val="center"/>
+        <w:tblLayout w:type="fixed"/>
         <w:tblLook w:firstColumn="1" w:firstRow="1" w:lastColumn="0" w:lastRow="0" w:noHBand="0" w:noVBand="1" w:val="04A0"/>
       </w:tblPr>
       <w:tblGrid>
-        <w:gridCol w:w="1728"/>
-        <w:gridCol w:w="1728"/>
-        <w:gridCol w:w="1728"/>
-        <w:gridCol w:w="1728"/>
-        <w:gridCol w:w="1728"/>
+        <w:gridCol w:w="1871"/>
+        <w:gridCol w:w="1984"/>
+        <w:gridCol w:w="1871"/>
+        <w:gridCol w:w="1871"/>
+        <w:gridCol w:w="1871"/>
       </w:tblGrid>
       <w:tr>
         <w:tc>
@@ -6222,7 +7269,7 @@
                 <w:b w:val="0"/>
                 <w:sz w:val="20"/>
               </w:rPr>
-              <w:t>ORDRE_1</w:t>
+              <w:t>INDICE_SUP_800</w:t>
             </w:r>
           </w:p>
         </w:tc>
@@ -6299,7 +7346,7 @@
                 <w:b w:val="0"/>
                 <w:sz w:val="20"/>
               </w:rPr>
-              <w:t>ORDRE_2</w:t>
+              <w:t>INDICE_400_799</w:t>
             </w:r>
           </w:p>
         </w:tc>
@@ -6376,7 +7423,7 @@
                 <w:b w:val="0"/>
                 <w:sz w:val="20"/>
               </w:rPr>
-              <w:t>ORDRE_3</w:t>
+              <w:t>INDICE_INF_400</w:t>
             </w:r>
           </w:p>
         </w:tc>
@@ -6456,14 +7503,15 @@
         <w:tblStyle w:val="TableGrid"/>
         <w:tblW w:type="auto" w:w="0"/>
         <w:jc w:val="center"/>
+        <w:tblLayout w:type="fixed"/>
         <w:tblLook w:firstColumn="1" w:firstRow="1" w:lastColumn="0" w:lastRow="0" w:noHBand="0" w:noVBand="1" w:val="04A0"/>
       </w:tblPr>
       <w:tblGrid>
-        <w:gridCol w:w="1728"/>
-        <w:gridCol w:w="1728"/>
-        <w:gridCol w:w="1728"/>
-        <w:gridCol w:w="1728"/>
-        <w:gridCol w:w="1728"/>
+        <w:gridCol w:w="1871"/>
+        <w:gridCol w:w="1984"/>
+        <w:gridCol w:w="1871"/>
+        <w:gridCol w:w="1871"/>
+        <w:gridCol w:w="1871"/>
       </w:tblGrid>
       <w:tr>
         <w:tc>
@@ -6564,7 +7612,7 @@
                 <w:b w:val="0"/>
                 <w:sz w:val="20"/>
               </w:rPr>
-              <w:t>ORDRE_1</w:t>
+              <w:t>INDICE_SUP_800</w:t>
             </w:r>
           </w:p>
         </w:tc>
@@ -6641,7 +7689,7 @@
                 <w:b w:val="0"/>
                 <w:sz w:val="20"/>
               </w:rPr>
-              <w:t>ORDRE_2</w:t>
+              <w:t>INDICE_400_799</w:t>
             </w:r>
           </w:p>
         </w:tc>
@@ -6718,7 +7766,7 @@
                 <w:b w:val="0"/>
                 <w:sz w:val="20"/>
               </w:rPr>
-              <w:t>ORDRE_3</w:t>
+              <w:t>INDICE_INF_400</w:t>
             </w:r>
           </w:p>
         </w:tc>
@@ -6813,11 +7861,12 @@
         <w:tblStyle w:val="TableGrid"/>
         <w:tblW w:type="auto" w:w="0"/>
         <w:jc w:val="center"/>
+        <w:tblLayout w:type="fixed"/>
         <w:tblLook w:firstColumn="1" w:firstRow="1" w:lastColumn="0" w:lastRow="0" w:noHBand="0" w:noVBand="1" w:val="04A0"/>
       </w:tblPr>
       <w:tblGrid>
-        <w:gridCol w:w="4320"/>
-        <w:gridCol w:w="4320"/>
+        <w:gridCol w:w="2381"/>
+        <w:gridCol w:w="7143"/>
       </w:tblGrid>
       <w:tr>
         <w:tc>
@@ -7043,6 +8092,38 @@
                 <w:sz w:val="20"/>
               </w:rPr>
               <w:t>1 mission × 1 tranche × 1 opérateur = 1 fichier de paiement.</w:t>
+            </w:r>
+          </w:p>
+        </w:tc>
+      </w:tr>
+      <w:tr>
+        <w:tc>
+          <w:tcPr>
+            <w:tcW w:type="dxa" w:w="2381"/>
+          </w:tcPr>
+          <w:p>
+            <w:r/>
+            <w:r>
+              <w:rPr>
+                <w:b w:val="0"/>
+                <w:sz w:val="20"/>
+              </w:rPr>
+              <w:t>Lot complémentaire</w:t>
+            </w:r>
+          </w:p>
+        </w:tc>
+        <w:tc>
+          <w:tcPr>
+            <w:tcW w:type="dxa" w:w="7143"/>
+          </w:tcPr>
+          <w:p>
+            <w:r/>
+            <w:r>
+              <w:rPr>
+                <w:b w:val="0"/>
+                <w:sz w:val="20"/>
+              </w:rPr>
+              <w:t>Nouveau lot pour les versements devenus payables après la confirmation d'un lot.</w:t>
             </w:r>
           </w:p>
         </w:tc>
@@ -7487,6 +8568,72 @@
   </w:num>
   <w:num w:numId="9">
     <w:abstractNumId w:val="0"/>
+  </w:num>
+  <w:num w:numId="10">
+    <w:abstractNumId w:val="7"/>
+    <w:lvlOverride w:ilvl="0">
+      <w:startOverride w:val="1"/>
+    </w:lvlOverride>
+  </w:num>
+  <w:num w:numId="11">
+    <w:abstractNumId w:val="7"/>
+    <w:lvlOverride w:ilvl="0">
+      <w:startOverride w:val="1"/>
+    </w:lvlOverride>
+  </w:num>
+  <w:num w:numId="12">
+    <w:abstractNumId w:val="7"/>
+    <w:lvlOverride w:ilvl="0">
+      <w:startOverride w:val="1"/>
+    </w:lvlOverride>
+  </w:num>
+  <w:num w:numId="13">
+    <w:abstractNumId w:val="7"/>
+    <w:lvlOverride w:ilvl="0">
+      <w:startOverride w:val="1"/>
+    </w:lvlOverride>
+  </w:num>
+  <w:num w:numId="14">
+    <w:abstractNumId w:val="7"/>
+    <w:lvlOverride w:ilvl="0">
+      <w:startOverride w:val="1"/>
+    </w:lvlOverride>
+  </w:num>
+  <w:num w:numId="15">
+    <w:abstractNumId w:val="7"/>
+    <w:lvlOverride w:ilvl="0">
+      <w:startOverride w:val="1"/>
+    </w:lvlOverride>
+  </w:num>
+  <w:num w:numId="16">
+    <w:abstractNumId w:val="7"/>
+    <w:lvlOverride w:ilvl="0">
+      <w:startOverride w:val="1"/>
+    </w:lvlOverride>
+  </w:num>
+  <w:num w:numId="17">
+    <w:abstractNumId w:val="7"/>
+    <w:lvlOverride w:ilvl="0">
+      <w:startOverride w:val="1"/>
+    </w:lvlOverride>
+  </w:num>
+  <w:num w:numId="18">
+    <w:abstractNumId w:val="7"/>
+    <w:lvlOverride w:ilvl="0">
+      <w:startOverride w:val="1"/>
+    </w:lvlOverride>
+  </w:num>
+  <w:num w:numId="19">
+    <w:abstractNumId w:val="7"/>
+    <w:lvlOverride w:ilvl="0">
+      <w:startOverride w:val="1"/>
+    </w:lvlOverride>
+  </w:num>
+  <w:num w:numId="20">
+    <w:abstractNumId w:val="7"/>
+    <w:lvlOverride w:ilvl="0">
+      <w:startOverride w:val="1"/>
+    </w:lvlOverride>
   </w:num>
 </w:numbering>
 </file>

</xml_diff>

<commit_message>
docs(guide): guide utilisateur complété (PDF de l'OM signé, restauration, exercice)
Nouveautés : PDF de l'OM signé par l'état et droits d'accès rétablis à la
restauration. §6.2 signatures de l'état sur le PDF de l'OM, §7.2 OM rejeté
non repêché, §13 exercice sans effet à ce jour, §13.3 ce que la sauvegarde
ne contient pas. Document régénéré par generer_guide_utilisateur.py.
Entrée CHANGELOG.

Co-Authored-By: Claude Opus 5.5 <noreply@anthropic.com>
Claude-Session: https://claude.ai/code/session_01MUfkbbz4qHVd6KNyyZzHX8
</commit_message>
<xml_diff>
--- a/docs/Guide-Utilisateur-ANaTT.docx
+++ b/docs/Guide-Utilisateur-ANaTT.docx
@@ -796,6 +796,100 @@
           </w:p>
         </w:tc>
       </w:tr>
+      <w:tr>
+        <w:tc>
+          <w:tcPr>
+            <w:tcW w:type="dxa" w:w="2041"/>
+          </w:tcPr>
+          <w:p>
+            <w:r/>
+            <w:r>
+              <w:rPr>
+                <w:b w:val="0"/>
+                <w:sz w:val="20"/>
+              </w:rPr>
+              <w:t>PDF de l'OM</w:t>
+            </w:r>
+          </w:p>
+        </w:tc>
+        <w:tc>
+          <w:tcPr>
+            <w:tcW w:type="dxa" w:w="6236"/>
+          </w:tcPr>
+          <w:p>
+            <w:r/>
+            <w:r>
+              <w:rPr>
+                <w:b w:val="0"/>
+                <w:sz w:val="20"/>
+              </w:rPr>
+              <w:t>Il reprend les signatures de l'état des avances qui couvre l'OM (même code de vérification que l'état), au fur et à mesure du circuit.</w:t>
+            </w:r>
+          </w:p>
+        </w:tc>
+        <w:tc>
+          <w:tcPr>
+            <w:tcW w:type="dxa" w:w="1247"/>
+          </w:tcPr>
+          <w:p>
+            <w:r/>
+            <w:r>
+              <w:rPr>
+                <w:b w:val="0"/>
+                <w:sz w:val="20"/>
+              </w:rPr>
+              <w:t>6.2</w:t>
+            </w:r>
+          </w:p>
+        </w:tc>
+      </w:tr>
+      <w:tr>
+        <w:tc>
+          <w:tcPr>
+            <w:tcW w:type="dxa" w:w="2041"/>
+          </w:tcPr>
+          <w:p>
+            <w:r/>
+            <w:r>
+              <w:rPr>
+                <w:b w:val="0"/>
+                <w:sz w:val="20"/>
+              </w:rPr>
+              <w:t>Restauration</w:t>
+            </w:r>
+          </w:p>
+        </w:tc>
+        <w:tc>
+          <w:tcPr>
+            <w:tcW w:type="dxa" w:w="6236"/>
+          </w:tcPr>
+          <w:p>
+            <w:r/>
+            <w:r>
+              <w:rPr>
+                <w:b w:val="0"/>
+                <w:sz w:val="20"/>
+              </w:rPr>
+              <w:t>Les droits d'accès sauvegardés reprennent effet immédiatement ; les réglages de « Paramètres » et les paraphes ne font pas partie de la sauvegarde.</w:t>
+            </w:r>
+          </w:p>
+        </w:tc>
+        <w:tc>
+          <w:tcPr>
+            <w:tcW w:type="dxa" w:w="1247"/>
+          </w:tcPr>
+          <w:p>
+            <w:r/>
+            <w:r>
+              <w:rPr>
+                <w:b w:val="0"/>
+                <w:sz w:val="20"/>
+              </w:rPr>
+              <w:t>13.3</w:t>
+            </w:r>
+          </w:p>
+        </w:tc>
+      </w:tr>
     </w:tbl>
     <w:p/>
     <w:p>
@@ -4463,6 +4557,14 @@
       </w:r>
     </w:p>
     <w:p>
+      <w:pPr>
+        <w:pStyle w:val="ListBullet"/>
+      </w:pPr>
+      <w:r>
+        <w:t>Le PDF de l'OM reprend les signatures de l'état des avances de sa mission, au fur et à mesure du circuit (contrôle, puis visa DAF, puis validation DG), avec le même code de vérification que l'état. Un OM rejeté n'en porte aucune, et un brouillon jamais. Le document de référence reste l'état de paiement.</w:t>
+      </w:r>
+    </w:p>
+    <w:p>
       <w:r>
         <w:rPr>
           <w:b w:val="0"/>
@@ -5037,7 +5139,7 @@
         <w:pStyle w:val="ListBullet"/>
       </w:pPr>
       <w:r>
-        <w:t>Validation de l'état des AVANCES : elle arrête l'état, fait passer tous les OM de la mission au statut VALIDE et ouvre les fichiers d'avance.</w:t>
+        <w:t>Validation de l'état des AVANCES : elle arrête l'état, fait passer les OM de la mission au statut VALIDE (un OM rejeté auparavant reste rejeté), fige l'avance de chacun et ouvre les fichiers d'avance.</w:t>
       </w:r>
     </w:p>
     <w:p>
@@ -5868,7 +5970,7 @@
         <w:pStyle w:val="ListBullet"/>
       </w:pPr>
       <w:r>
-        <w:t>Année fiscale : l'exercice en cours est paramétrable — année (liste dynamique) et mois de début d'exercice. Par défaut, l'exercice coïncide avec l'année civile (début janvier) ; un mois de début différent produit un exercice à cheval, libellé « 2026-2027 ».</w:t>
+        <w:t>Année fiscale : l'exercice en cours est paramétrable — année (liste dynamique) et mois de début d'exercice. Par défaut, l'exercice coïncide avec l'année civile (début janvier) ; un mois de début différent produit un exercice à cheval, libellé « 2026-2027 ». À ce jour, ce réglage n'agit ni sur les montants, ni sur les rapports, ni sur les documents, qui se filtrent par dates.</w:t>
       </w:r>
     </w:p>
     <w:p>
@@ -5985,6 +6087,49 @@
                 <w:sz w:val="20"/>
               </w:rPr>
               <w:t>Juste avant d'écraser la base, l'application crée automatiquement une sauvegarde de l'état courant. En cas d'erreur, il suffit de restaurer cette sauvegarde de sécurité, la plus récente de la liste. Toutes les données saisies après la date de la sauvegarde restaurée sont perdues : prévenez les utilisateurs et choisissez un moment sans activité. L'opération est tracée au journal d'audit.</w:t>
+            </w:r>
+          </w:p>
+        </w:tc>
+      </w:tr>
+    </w:tbl>
+    <w:p/>
+    <w:p>
+      <w:pPr>
+        <w:pStyle w:val="ListBullet"/>
+      </w:pPr>
+      <w:r>
+        <w:t>Après une restauration, la matrice des droits d'accès de la sauvegarde s'applique immédiatement, sans autre manipulation.</w:t>
+      </w:r>
+    </w:p>
+    <w:tbl>
+      <w:tblPr>
+        <w:tblW w:type="auto" w:w="0"/>
+        <w:jc w:val="center"/>
+        <w:tblLook w:firstColumn="1" w:firstRow="1" w:lastColumn="0" w:lastRow="0" w:noHBand="0" w:noVBand="1" w:val="04A0"/>
+      </w:tblPr>
+      <w:tblGrid>
+        <w:gridCol w:w="8640"/>
+      </w:tblGrid>
+      <w:tr>
+        <w:tc>
+          <w:tcPr>
+            <w:tcW w:type="dxa" w:w="9524"/>
+            <w:shd w:val="clear" w:fill="EDFAF2"/>
+          </w:tcPr>
+          <w:p>
+            <w:r>
+              <w:rPr>
+                <w:b/>
+                <w:color w:val="0A3D1F"/>
+                <w:sz w:val="20"/>
+              </w:rPr>
+              <w:t xml:space="preserve">Ce que la sauvegarde ne contient pas : </w:t>
+            </w:r>
+            <w:r>
+              <w:rPr>
+                <w:sz w:val="20"/>
+              </w:rPr>
+              <w:t>La sauvegarde porte sur la base de données. Les réglages de l'écran « Paramètres » (part de l'avance, exercice, messagerie), les paraphes de l'écran « Signatures » et les fichiers produits (PDF, fichiers de paiement) sont conservés sur le serveur, hors de la base : une restauration ne les modifie pas. Leur copie relève de l'hébergement (dossier « storage » du serveur).</w:t>
             </w:r>
           </w:p>
         </w:tc>

</xml_diff>

<commit_message>
docs(guide, démo, workflows): PDF de l'OM amendé et ordre des sauvegardes
Co-Authored-By: Claude Opus 5.5 <noreply@anthropic.com>
Claude-Session: https://claude.ai/code/session_01MUfkbbz4qHVd6KNyyZzHX8
</commit_message>
<xml_diff>
--- a/docs/Guide-Utilisateur-ANaTT.docx
+++ b/docs/Guide-Utilisateur-ANaTT.docx
@@ -729,7 +729,7 @@
                 <w:b w:val="0"/>
                 <w:sz w:val="20"/>
               </w:rPr>
-              <w:t>Téléchargement et restauration d'une sauvegarde, avec sauvegarde de sécurité automatique avant restauration.</w:t>
+              <w:t>Téléchargement et restauration d'une sauvegarde, avec sauvegarde de sécurité automatique avant restauration. La liste est classée de la plus récente à la plus ancienne.</w:t>
             </w:r>
           </w:p>
         </w:tc>
@@ -839,6 +839,53 @@
                 <w:sz w:val="20"/>
               </w:rPr>
               <w:t>6.2</w:t>
+            </w:r>
+          </w:p>
+        </w:tc>
+      </w:tr>
+      <w:tr>
+        <w:tc>
+          <w:tcPr>
+            <w:tcW w:type="dxa" w:w="2041"/>
+          </w:tcPr>
+          <w:p>
+            <w:r/>
+            <w:r>
+              <w:rPr>
+                <w:b w:val="0"/>
+                <w:sz w:val="20"/>
+              </w:rPr>
+              <w:t>PDF d'un OM amendé</w:t>
+            </w:r>
+          </w:p>
+        </w:tc>
+        <w:tc>
+          <w:tcPr>
+            <w:tcW w:type="dxa" w:w="6236"/>
+          </w:tcPr>
+          <w:p>
+            <w:r/>
+            <w:r>
+              <w:rPr>
+                <w:b w:val="0"/>
+                <w:sz w:val="20"/>
+              </w:rPr>
+              <w:t>Il est régénéré après chaque amendement et indique l'avance engagée, le reliquat ajusté ou le trop-perçu, avec le rappel de l'amendement.</w:t>
+            </w:r>
+          </w:p>
+        </w:tc>
+        <w:tc>
+          <w:tcPr>
+            <w:tcW w:type="dxa" w:w="1247"/>
+          </w:tcPr>
+          <w:p>
+            <w:r/>
+            <w:r>
+              <w:rPr>
+                <w:b w:val="0"/>
+                <w:sz w:val="20"/>
+              </w:rPr>
+              <w:t>6.3</w:t>
             </w:r>
           </w:p>
         </w:tc>
@@ -4730,6 +4777,14 @@
     </w:p>
     <w:p>
       <w:pPr>
+        <w:pStyle w:val="ListBullet"/>
+      </w:pPr>
+      <w:r>
+        <w:t>Le PDF de l'OM (bouton « PDF » de la fiche) est régénéré après l'amendement. Il n'affiche plus « Avance (70 %) / Reliquat (30 %) » mais « Avance engagée », puis « Reliquat (ajusté par amendement) » ou, en cas de réduction forte, « Trop-perçu (à recouvrer par retenue sur salaire) » avec un montant négatif et la mention « Montant total dû ». Un encadré rappelle l'amendement : date, nombre de jours avant et après, motif.</w:t>
+      </w:r>
+    </w:p>
+    <w:p>
+      <w:pPr>
         <w:pStyle w:val="Heading1"/>
       </w:pPr>
       <w:r>
@@ -6004,6 +6059,14 @@
           <w:i w:val="0"/>
         </w:rPr>
         <w:t>Réservé au SUPER_ADMIN, écran « Sauvegardes ». Une sauvegarde automatique est faite chaque nuit (02:00) par le serveur ; le bouton « Nouvelle sauvegarde » en crée une immédiatement.</w:t>
+      </w:r>
+    </w:p>
+    <w:p>
+      <w:pPr>
+        <w:pStyle w:val="ListBullet"/>
+      </w:pPr>
+      <w:r>
+        <w:t>La liste est classée de la plus récente à la plus ancienne.</w:t>
       </w:r>
     </w:p>
     <w:p>

</xml_diff>

<commit_message>
fix(fiche OM): lien vers le PDF officiel ; guide utilisateur à jour
La fiche de l'OM ne menait jamais à l'écran OM-07 (/ordres/:id/pdf) : seul
« Télécharger le brouillon » existait, masqué une fois l'OM validé, si bien que
le PDF signé et le PDF amendé n'étaient joignables qu'en tapant l'adresse.
Lien « PDF de l'OM » ajouté à côté de « Historique » ; test Vitest.

Guide utilisateur régénéré : accès au PDF de l'OM, journal des amendements le
plus récent en tête, document de retenue (motif du dernier amendement), boutons
« Document » et « Marquer recouvré » (le guide citait un bouton inexistant).
Scénario de démo §7, revue (n° 18), CHANGELOG, compteurs Vitest (114).

Co-Authored-By: Claude Opus 5.5 <noreply@anthropic.com>
Claude-Session: https://claude.ai/code/session_01MUfkbbz4qHVd6KNyyZzHX8
</commit_message>
<xml_diff>
--- a/docs/Guide-Utilisateur-ANaTT.docx
+++ b/docs/Guide-Utilisateur-ANaTT.docx
@@ -870,7 +870,7 @@
                 <w:b w:val="0"/>
                 <w:sz w:val="20"/>
               </w:rPr>
-              <w:t>Il est régénéré après chaque amendement et indique l'avance engagée, le reliquat ajusté ou le trop-perçu, avec le rappel de l'amendement.</w:t>
+              <w:t>Il est régénéré après chaque amendement et indique l'avance engagée, le reliquat ajusté ou le trop-perçu, avec le rappel du dernier amendement.</w:t>
             </w:r>
           </w:p>
         </w:tc>
@@ -886,6 +886,53 @@
                 <w:sz w:val="20"/>
               </w:rPr>
               <w:t>6.3</w:t>
+            </w:r>
+          </w:p>
+        </w:tc>
+      </w:tr>
+      <w:tr>
+        <w:tc>
+          <w:tcPr>
+            <w:tcW w:type="dxa" w:w="2041"/>
+          </w:tcPr>
+          <w:p>
+            <w:r/>
+            <w:r>
+              <w:rPr>
+                <w:b w:val="0"/>
+                <w:sz w:val="20"/>
+              </w:rPr>
+              <w:t>Fiche de l'OM</w:t>
+            </w:r>
+          </w:p>
+        </w:tc>
+        <w:tc>
+          <w:tcPr>
+            <w:tcW w:type="dxa" w:w="6236"/>
+          </w:tcPr>
+          <w:p>
+            <w:r/>
+            <w:r>
+              <w:rPr>
+                <w:b w:val="0"/>
+                <w:sz w:val="20"/>
+              </w:rPr>
+              <w:t>Nouveau lien « PDF de l'OM » en haut de la fiche : le PDF officiel reste accessible une fois l'OM validé.</w:t>
+            </w:r>
+          </w:p>
+        </w:tc>
+        <w:tc>
+          <w:tcPr>
+            <w:tcW w:type="dxa" w:w="1247"/>
+          </w:tcPr>
+          <w:p>
+            <w:r/>
+            <w:r>
+              <w:rPr>
+                <w:b w:val="0"/>
+                <w:sz w:val="20"/>
+              </w:rPr>
+              <w:t>6.2</w:t>
             </w:r>
           </w:p>
         </w:tc>
@@ -4600,7 +4647,7 @@
         <w:pStyle w:val="ListBullet"/>
       </w:pPr>
       <w:r>
-        <w:t>Téléchargement du brouillon de l'OM et consultation de son journal d'audit.</w:t>
+        <w:t>En haut de la fiche, « Historique » ouvre le journal d'audit de l'OM et « PDF de l'OM » ouvre l'aperçu du PDF officiel, avec le bouton « Télécharger PDF ». Ce lien reste disponible une fois l'OM validé. Avant validation, « Télécharger le brouillon » fournit en plus une épreuve filigranée.</w:t>
       </w:r>
     </w:p>
     <w:p>
@@ -4748,7 +4795,7 @@
         <w:pStyle w:val="ListBullet"/>
       </w:pPr>
       <w:r>
-        <w:t>Chaque amendement est historisé (jours et montants avant / après, écart, motif, auteur, date) et consultable sur la fiche de l'OM ; il est tracé au journal d'audit.</w:t>
+        <w:t>Chaque amendement est historisé (jours et montants avant / après, écart, motif, auteur, date) et consultable sur la fiche de l'OM, le plus récent en tête ; il est tracé au journal d'audit.</w:t>
       </w:r>
     </w:p>
     <w:p>
@@ -4780,7 +4827,7 @@
         <w:pStyle w:val="ListBullet"/>
       </w:pPr>
       <w:r>
-        <w:t>Le PDF de l'OM (bouton « PDF » de la fiche) est régénéré après l'amendement. Il n'affiche plus « Avance (70 %) / Reliquat (30 %) » mais « Avance engagée », puis « Reliquat (ajusté par amendement) » ou, en cas de réduction forte, « Trop-perçu (à recouvrer par retenue sur salaire) » avec un montant négatif et la mention « Montant total dû ». Un encadré rappelle l'amendement : date, nombre de jours avant et après, motif.</w:t>
+        <w:t>Le PDF de l'OM (lien « PDF de l'OM » en haut de la fiche) est régénéré après l'amendement. Il n'affiche plus « Avance (70 %) / Reliquat (30 %) » mais « Avance engagée », puis « Reliquat (ajusté par amendement) » ou, en cas de réduction forte, « Trop-perçu (à recouvrer par retenue sur salaire) » avec un montant négatif et la mention « Montant total dû ». Un encadré rappelle l'amendement : date, nombre de jours avant et après, motif.</w:t>
       </w:r>
     </w:p>
     <w:p>
@@ -5749,7 +5796,7 @@
         </w:numPr>
       </w:pPr>
       <w:r>
-        <w:t>Téléchargez le « document de retenue sur salaire » (PDF) à remettre à la RH ; il porte le montant à retenir, en chiffres et en toutes lettres.</w:t>
+        <w:t>Cliquez sur « Document » pour télécharger le « document de retenue sur salaire » (PDF) à remettre à la RH ; il porte le montant à retenir, en chiffres et en toutes lettres, et le motif du dernier amendement.</w:t>
       </w:r>
     </w:p>
     <w:p>
@@ -5761,7 +5808,7 @@
         </w:numPr>
       </w:pPr>
       <w:r>
-        <w:t>Une fois la retenue appliquée par la RH, cliquez sur « Constater le recouvrement » : le versement passe au statut RECOUVRÉ.</w:t>
+        <w:t>Une fois la retenue appliquée par la RH, cliquez sur « Marquer recouvré » : le versement passe au statut RECOUVRÉ.</w:t>
       </w:r>
     </w:p>
     <w:p>

</xml_diff>

<commit_message>
docs(guide) : guide utilisateur confronté aux libellés de l'interface et régénéré (n° 1 à 32)
Co-Authored-By: Claude Opus 5.5 <noreply@anthropic.com>
Claude-Session: https://claude.ai/code/session_01MUfkbbz4qHVd6KNyyZzHX8
</commit_message>
<xml_diff>
--- a/docs/Guide-Utilisateur-ANaTT.docx
+++ b/docs/Guide-Utilisateur-ANaTT.docx
@@ -984,6 +984,288 @@
           </w:p>
         </w:tc>
       </w:tr>
+      <w:tr>
+        <w:tc>
+          <w:tcPr>
+            <w:tcW w:type="dxa" w:w="2041"/>
+          </w:tcPr>
+          <w:p>
+            <w:r/>
+            <w:r>
+              <w:rPr>
+                <w:b w:val="0"/>
+                <w:sz w:val="20"/>
+              </w:rPr>
+              <w:t>OM soldé</w:t>
+            </w:r>
+          </w:p>
+        </w:tc>
+        <w:tc>
+          <w:tcPr>
+            <w:tcW w:type="dxa" w:w="6236"/>
+          </w:tcPr>
+          <w:p>
+            <w:r/>
+            <w:r>
+              <w:rPr>
+                <w:b w:val="0"/>
+                <w:sz w:val="20"/>
+              </w:rPr>
+              <w:t>Un OM passe SOLDÉ quand tout ce qui lui est dû est réglé : versements confirmés, ou trop-perçu recouvré. Une tranche à 0 (part d'avance de 0 ou 100 %) ne le retient pas, et un OM exonéré est soldé dès sa validation.</w:t>
+            </w:r>
+          </w:p>
+        </w:tc>
+        <w:tc>
+          <w:tcPr>
+            <w:tcW w:type="dxa" w:w="1247"/>
+          </w:tcPr>
+          <w:p>
+            <w:r/>
+            <w:r>
+              <w:rPr>
+                <w:b w:val="0"/>
+                <w:sz w:val="20"/>
+              </w:rPr>
+              <w:t>9.2, 9.5</w:t>
+            </w:r>
+          </w:p>
+        </w:tc>
+      </w:tr>
+      <w:tr>
+        <w:tc>
+          <w:tcPr>
+            <w:tcW w:type="dxa" w:w="2041"/>
+          </w:tcPr>
+          <w:p>
+            <w:r/>
+            <w:r>
+              <w:rPr>
+                <w:b w:val="0"/>
+                <w:sz w:val="20"/>
+              </w:rPr>
+              <w:t>Amendement d'un OM soldé</w:t>
+            </w:r>
+          </w:p>
+        </w:tc>
+        <w:tc>
+          <w:tcPr>
+            <w:tcW w:type="dxa" w:w="6236"/>
+          </w:tcPr>
+          <w:p>
+            <w:r/>
+            <w:r>
+              <w:rPr>
+                <w:b w:val="0"/>
+                <w:sz w:val="20"/>
+              </w:rPr>
+              <w:t>« Amender » reste proposé sur un OM soldé dont le reliquat n'est ni payé ni recouvré : une rallonge le rouvre, une réduction à zéro le solde.</w:t>
+            </w:r>
+          </w:p>
+        </w:tc>
+        <w:tc>
+          <w:tcPr>
+            <w:tcW w:type="dxa" w:w="1247"/>
+          </w:tcPr>
+          <w:p>
+            <w:r/>
+            <w:r>
+              <w:rPr>
+                <w:b w:val="0"/>
+                <w:sz w:val="20"/>
+              </w:rPr>
+              <w:t>6.3</w:t>
+            </w:r>
+          </w:p>
+        </w:tc>
+      </w:tr>
+      <w:tr>
+        <w:tc>
+          <w:tcPr>
+            <w:tcW w:type="dxa" w:w="2041"/>
+          </w:tcPr>
+          <w:p>
+            <w:r/>
+            <w:r>
+              <w:rPr>
+                <w:b w:val="0"/>
+                <w:sz w:val="20"/>
+              </w:rPr>
+              <w:t>Lot complémentaire</w:t>
+            </w:r>
+          </w:p>
+        </w:tc>
+        <w:tc>
+          <w:tcPr>
+            <w:tcW w:type="dxa" w:w="6236"/>
+          </w:tcPr>
+          <w:p>
+            <w:r/>
+            <w:r>
+              <w:rPr>
+                <w:b w:val="0"/>
+                <w:sz w:val="20"/>
+              </w:rPr>
+              <w:t>Sur l'écran de génération, le bouton devient « Générer le lot complémentaire » dès qu'un lot confirmé laisse des bénéficiaires à payer.</w:t>
+            </w:r>
+          </w:p>
+        </w:tc>
+        <w:tc>
+          <w:tcPr>
+            <w:tcW w:type="dxa" w:w="1247"/>
+          </w:tcPr>
+          <w:p>
+            <w:r/>
+            <w:r>
+              <w:rPr>
+                <w:b w:val="0"/>
+                <w:sz w:val="20"/>
+              </w:rPr>
+              <w:t>9.3</w:t>
+            </w:r>
+          </w:p>
+        </w:tc>
+      </w:tr>
+      <w:tr>
+        <w:tc>
+          <w:tcPr>
+            <w:tcW w:type="dxa" w:w="2041"/>
+          </w:tcPr>
+          <w:p>
+            <w:r/>
+            <w:r>
+              <w:rPr>
+                <w:b w:val="0"/>
+                <w:sz w:val="20"/>
+              </w:rPr>
+              <w:t>Notifications</w:t>
+            </w:r>
+          </w:p>
+        </w:tc>
+        <w:tc>
+          <w:tcPr>
+            <w:tcW w:type="dxa" w:w="6236"/>
+          </w:tcPr>
+          <w:p>
+            <w:r/>
+            <w:r>
+              <w:rPr>
+                <w:b w:val="0"/>
+                <w:sz w:val="20"/>
+              </w:rPr>
+              <w:t>Seuls les comptes actifs reçoivent la cloche et l'e-mail ; un compte désactivé n'est plus prévenu.</w:t>
+            </w:r>
+          </w:p>
+        </w:tc>
+        <w:tc>
+          <w:tcPr>
+            <w:tcW w:type="dxa" w:w="1247"/>
+          </w:tcPr>
+          <w:p>
+            <w:r/>
+            <w:r>
+              <w:rPr>
+                <w:b w:val="0"/>
+                <w:sz w:val="20"/>
+              </w:rPr>
+              <w:t>7.2</w:t>
+            </w:r>
+          </w:p>
+        </w:tc>
+      </w:tr>
+      <w:tr>
+        <w:tc>
+          <w:tcPr>
+            <w:tcW w:type="dxa" w:w="2041"/>
+          </w:tcPr>
+          <w:p>
+            <w:r/>
+            <w:r>
+              <w:rPr>
+                <w:b w:val="0"/>
+                <w:sz w:val="20"/>
+              </w:rPr>
+              <w:t>Fonction imprimée</w:t>
+            </w:r>
+          </w:p>
+        </w:tc>
+        <w:tc>
+          <w:tcPr>
+            <w:tcW w:type="dxa" w:w="6236"/>
+          </w:tcPr>
+          <w:p>
+            <w:r/>
+            <w:r>
+              <w:rPr>
+                <w:b w:val="0"/>
+                <w:sz w:val="20"/>
+              </w:rPr>
+              <w:t>Sans fonction saisie dans « Signatures », l'état imprime celle du compte du signataire, puis le libellé du poste.</w:t>
+            </w:r>
+          </w:p>
+        </w:tc>
+        <w:tc>
+          <w:tcPr>
+            <w:tcW w:type="dxa" w:w="1247"/>
+          </w:tcPr>
+          <w:p>
+            <w:r/>
+            <w:r>
+              <w:rPr>
+                <w:b w:val="0"/>
+                <w:sz w:val="20"/>
+              </w:rPr>
+              <w:t>7.4</w:t>
+            </w:r>
+          </w:p>
+        </w:tc>
+      </w:tr>
+      <w:tr>
+        <w:tc>
+          <w:tcPr>
+            <w:tcW w:type="dxa" w:w="2041"/>
+          </w:tcPr>
+          <w:p>
+            <w:r/>
+            <w:r>
+              <w:rPr>
+                <w:b w:val="0"/>
+                <w:sz w:val="20"/>
+              </w:rPr>
+              <w:t>Menu</w:t>
+            </w:r>
+          </w:p>
+        </w:tc>
+        <w:tc>
+          <w:tcPr>
+            <w:tcW w:type="dxa" w:w="6236"/>
+          </w:tcPr>
+          <w:p>
+            <w:r/>
+            <w:r>
+              <w:rPr>
+                <w:b w:val="0"/>
+                <w:sz w:val="20"/>
+              </w:rPr>
+              <w:t>Libellés accentués : « États de paiement », « Générer MTN », « Générer Moov », « Régularisations », « Barèmes », « Paramètres », « Matrice des permissions ».</w:t>
+            </w:r>
+          </w:p>
+        </w:tc>
+        <w:tc>
+          <w:tcPr>
+            <w:tcW w:type="dxa" w:w="1247"/>
+          </w:tcPr>
+          <w:p>
+            <w:r/>
+            <w:r>
+              <w:rPr>
+                <w:b w:val="0"/>
+                <w:sz w:val="20"/>
+              </w:rPr>
+              <w:t>—</w:t>
+            </w:r>
+          </w:p>
+        </w:tc>
+      </w:tr>
     </w:tbl>
     <w:p/>
     <w:p>
@@ -4695,7 +4977,7 @@
               <w:rPr>
                 <w:sz w:val="20"/>
               </w:rPr>
-              <w:t>Pour une mission dont aucun état de paiement n'a été établi, la fiche d'un OM au statut IMPORTE propose les boutons « Valider » (CONTROLEUR) et « Rejeter » (motif d'au moins 10 caractères). Dès qu'un état existe pour la mission, ces boutons disparaissent : la validation passe alors obligatoirement par l'état. Un OM rejeté voit ses versements en attente ANNULÉS : il ne sera jamais payé.</w:t>
+              <w:t>Pour une mission dont aucun état de paiement n'a été établi, la fiche d'un OM au statut IMPORTE propose les boutons « Valider » (CONTROLEUR) et « Rejeter » (motif d'au moins 10 caractères). Dès qu'un état existe pour la mission, ces boutons disparaissent : la validation passe alors obligatoirement par l'état. Un OM rejeté voit ses versements en attente ANNULÉS : il ne sera jamais payé. Un OM exonéré (prise en charge par un tiers) validé ainsi passe directement SOLDÉ.</w:t>
             </w:r>
           </w:p>
         </w:tc>
@@ -5252,6 +5534,14 @@
         <w:t>Validation de l'état des RELIQUATS : elle ouvre les fichiers de reliquat (les OM sont déjà VALIDE).</w:t>
       </w:r>
     </w:p>
+    <w:p>
+      <w:pPr>
+        <w:pStyle w:val="ListBullet"/>
+      </w:pPr>
+      <w:r>
+        <w:t>Notifications : à chaque étape, les comptes actifs du profil attendu reçoivent une notification (cloche et e-mail) ; à la validation finale, l'agent financier est prévenu ; en cas de rejet, le gestionnaire. Un compte désactivé n'est jamais notifié.</w:t>
+      </w:r>
+    </w:p>
     <w:tbl>
       <w:tblPr>
         <w:tblW w:type="auto" w:w="0"/>
@@ -5409,6 +5699,14 @@
     <w:p/>
     <w:p>
       <w:pPr>
+        <w:pStyle w:val="ListBullet"/>
+      </w:pPr>
+      <w:r>
+        <w:t>Si l'écran « Signatures » ne renseigne pas un poste, l'état imprime le nom du compte qui signe ; pour la fonction, celle enregistrée sur ce compte, à défaut le libellé du poste (« Le Directeur Général »…). Nom et fonction sont figés au moment de la signature.</w:t>
+      </w:r>
+    </w:p>
+    <w:p>
+      <w:pPr>
         <w:pStyle w:val="Heading1"/>
       </w:pPr>
       <w:r>
@@ -5559,7 +5857,7 @@
         </w:numPr>
       </w:pPr>
       <w:r>
-        <w:t>Ouvrez « Paiements MTN » ou « Paiements Moov ».</w:t>
+        <w:t>Dans le menu Paiements, ouvrez « Générer MTN » ou « Générer Moov ».</w:t>
       </w:r>
     </w:p>
     <w:p>
@@ -5571,7 +5869,7 @@
         </w:numPr>
       </w:pPr>
       <w:r>
-        <w:t>Sélectionnez la mission, la tranche (AVANCE ou RELIQUAT) et l'opérateur.</w:t>
+        <w:t>Sélectionnez la mission et la tranche (AVANCE ou RELIQUAT) : l'« Aperçu des bénéficiaires » éligibles s'affiche aussitôt.</w:t>
       </w:r>
     </w:p>
     <w:p>
@@ -5583,19 +5881,7 @@
         </w:numPr>
       </w:pPr>
       <w:r>
-        <w:t>Cliquez sur « Prévisualiser » : la liste des bénéficiaires éligibles s'affiche.</w:t>
-      </w:r>
-    </w:p>
-    <w:p>
-      <w:pPr>
-        <w:pStyle w:val="ListNumber"/>
-        <w:numPr>
-          <w:ilvl w:val="0"/>
-          <w:numId w:val="17"/>
-        </w:numPr>
-      </w:pPr>
-      <w:r>
-        <w:t>Cliquez sur « Générer » : le fichier (.txt pour MTN, .xlsx pour Moov) est téléchargé. Le lot passe au statut GÉNÉRÉ.</w:t>
+        <w:t>Cliquez sur « Générer le fichier.txt » (MTN) ou « Générer le fichier.xlsx » (Moov) : le fichier est téléchargé et le lot passe au statut GÉNÉRÉ.</w:t>
       </w:r>
     </w:p>
     <w:p>
@@ -5604,7 +5890,7 @@
           <w:b w:val="0"/>
           <w:i w:val="0"/>
         </w:rPr>
-        <w:t>Pour un volume important (plus de 50 bénéficiaires), la génération se fait en arrière-plan : une barre de progression s'affiche et le fichier se télécharge automatiquement dès qu'il est prêt. Restez sur l'écran pendant le traitement ; le lot reste ensuite re-téléchargeable depuis la liste des lots.</w:t>
+        <w:t>Pour un volume important (plus de 50 bénéficiaires), la génération peut se faire en arrière-plan : un bandeau de suivi s'affiche et le fichier se télécharge automatiquement dès qu'il est prêt. Restez sur l'écran pendant le traitement ; le lot reste ensuite re-téléchargeable depuis la liste des lots. Sur l'hébergement de production, le traitement se fait d'un seul tenant : si une erreur s'affiche, rechargez la page avant toute autre action, car un lot précédemment généré peut être passé en erreur.</w:t>
       </w:r>
     </w:p>
     <w:p>
@@ -5636,7 +5922,7 @@
         </w:numPr>
       </w:pPr>
       <w:r>
-        <w:t>Une fois le dépôt réussi, revenez dans l'application et cliquez sur « Confirmer » pour le lot.</w:t>
+        <w:t>Une fois le dépôt réussi, revenez sur l'écran de génération et cliquez sur « Confirmer le paiement ».</w:t>
       </w:r>
     </w:p>
     <w:p>
@@ -5648,7 +5934,7 @@
         </w:numPr>
       </w:pPr>
       <w:r>
-        <w:t>Le lot et ses versements passent au statut CONFIRMÉ et sont horodatés. L'OM dont tous les versements sont confirmés passe au statut SOLDÉ.</w:t>
+        <w:t>Le lot et ses versements passent au statut CONFIRMÉ et sont horodatés. L'OM dont tout ce qui est dû est réglé passe au statut SOLDÉ (une tranche à 0 ne compte pas).</w:t>
       </w:r>
     </w:p>
     <w:p>
@@ -5664,7 +5950,7 @@
         <w:pStyle w:val="ListBullet"/>
       </w:pPr>
       <w:r>
-        <w:t>Tant qu'un lot n'est pas confirmé, vous pouvez le régénérer.</w:t>
+        <w:t>Tant qu'un lot n'est pas confirmé, vous pouvez le régénérer (« Régénérer le fichier »).</w:t>
       </w:r>
     </w:p>
     <w:p>
@@ -5672,7 +5958,7 @@
         <w:pStyle w:val="ListBullet"/>
       </w:pPr>
       <w:r>
-        <w:t>En cas de problème de dépôt, marquez le lot « en erreur » : cela réautorise une nouvelle génération. Ses versements redeviennent EN ATTENTE et reprennent le téléphone et l'opérateur ACTUELS de l'agent : si le dépôt a échoué à cause d'un mauvais numéro, corrigez la fiche de l'agent, puis régénérez.</w:t>
+        <w:t>En cas de problème de dépôt, cliquez sur « Marquer en erreur » : cela réautorise une nouvelle génération. Ses versements redeviennent EN ATTENTE et reprennent le téléphone et l'opérateur ACTUELS de l'agent : si le dépôt a échoué à cause d'un mauvais numéro, corrigez la fiche de l'agent, puis régénérez.</w:t>
       </w:r>
     </w:p>
     <w:p>
@@ -5808,7 +6094,7 @@
         </w:numPr>
       </w:pPr>
       <w:r>
-        <w:t>Une fois la retenue appliquée par la RH, cliquez sur « Marquer recouvré » : le versement passe au statut RECOUVRÉ.</w:t>
+        <w:t>Une fois la retenue appliquée par la RH, cliquez sur « Marquer recouvré » : le versement passe au statut RECOUVRÉ. Si l'avance de l'OM est payée, l'OM passe SOLDÉ.</w:t>
       </w:r>
     </w:p>
     <w:p>
@@ -6592,7 +6878,7 @@
                 <w:b w:val="0"/>
                 <w:sz w:val="20"/>
               </w:rPr>
-              <w:t>Étapes intermédiaires du circuit par OM (validation directe, activée en option).</w:t>
+              <w:t>Valeurs héritées de l'ancien circuit par OM, qui n'existe plus : elles ne sont plus produites.</w:t>
             </w:r>
           </w:p>
         </w:tc>
@@ -6688,7 +6974,7 @@
                 <w:b w:val="0"/>
                 <w:sz w:val="20"/>
               </w:rPr>
-              <w:t>Tous les versements de l'OM ont été confirmés, ou le trop-perçu recouvré (ou OM exonéré).</w:t>
+              <w:t>Tout ce qui est dû est réglé : versements non nuls confirmés, trop-perçu recouvré, ou OM exonéré validé. Encore amendable si le reliquat n'est ni payé ni recouvré.</w:t>
             </w:r>
           </w:p>
         </w:tc>

</xml_diff>

<commit_message>
docs(guide) : guide utilisateur à jour des décisions D1 à D4 et des correctifs d'interface
- Nouveautés 1.4 : notifications selon les droits réels, heure du Bénin, écran
  de génération rechargé après un échec, libellés d'un OM amendé, notifications
  de l'écran Configuration e-mail.
- Chapitres 6.3, 7.2, 9.1, 11 et 13.2 alignés sur l'application.
- 12 figures tirées des captures de l'application réelle (docs/ecrans/).

Co-Authored-By: Claude Opus 5.5 <noreply@anthropic.com>
Claude-Session: https://claude.ai/code/session_01MUfkbbz4qHVd6KNyyZzHX8
</commit_message>
<xml_diff>
--- a/docs/Guide-Utilisateur-ANaTT.docx
+++ b/docs/Guide-Utilisateur-ANaTT.docx
@@ -1152,7 +1152,7 @@
                 <w:b w:val="0"/>
                 <w:sz w:val="20"/>
               </w:rPr>
-              <w:t>Seuls les comptes actifs reçoivent la cloche et l'e-mail ; un compte désactivé n'est plus prévenu.</w:t>
+              <w:t>Elles suivent les droits réels : un compte reçoit la cloche et l'e-mail dès qu'il détient la permission de l'étape (rôle personnalisé ou droit accordé à titre individuel compris) ; un droit retiré n'est plus notifié. Seuls les comptes actifs sont prévenus.</w:t>
             </w:r>
           </w:p>
         </w:tc>
@@ -1168,6 +1168,194 @@
                 <w:sz w:val="20"/>
               </w:rPr>
               <w:t>7.2</w:t>
+            </w:r>
+          </w:p>
+        </w:tc>
+      </w:tr>
+      <w:tr>
+        <w:tc>
+          <w:tcPr>
+            <w:tcW w:type="dxa" w:w="2041"/>
+          </w:tcPr>
+          <w:p>
+            <w:r/>
+            <w:r>
+              <w:rPr>
+                <w:b w:val="0"/>
+                <w:sz w:val="20"/>
+              </w:rPr>
+              <w:t>Heure du Bénin</w:t>
+            </w:r>
+          </w:p>
+        </w:tc>
+        <w:tc>
+          <w:tcPr>
+            <w:tcW w:type="dxa" w:w="6236"/>
+          </w:tcPr>
+          <w:p>
+            <w:r/>
+            <w:r>
+              <w:rPr>
+                <w:b w:val="0"/>
+                <w:sz w:val="20"/>
+              </w:rPr>
+              <w:t>Les dates et heures enregistrées (paiements, signatures, journal) sont à l'heure du Bénin. Un paiement confirmé le 1er du mois juste après minuit compte dans ce mois.</w:t>
+            </w:r>
+          </w:p>
+        </w:tc>
+        <w:tc>
+          <w:tcPr>
+            <w:tcW w:type="dxa" w:w="1247"/>
+          </w:tcPr>
+          <w:p>
+            <w:r/>
+            <w:r>
+              <w:rPr>
+                <w:b w:val="0"/>
+                <w:sz w:val="20"/>
+              </w:rPr>
+              <w:t>11</w:t>
+            </w:r>
+          </w:p>
+        </w:tc>
+      </w:tr>
+      <w:tr>
+        <w:tc>
+          <w:tcPr>
+            <w:tcW w:type="dxa" w:w="2041"/>
+          </w:tcPr>
+          <w:p>
+            <w:r/>
+            <w:r>
+              <w:rPr>
+                <w:b w:val="0"/>
+                <w:sz w:val="20"/>
+              </w:rPr>
+              <w:t>Échec d'une génération</w:t>
+            </w:r>
+          </w:p>
+        </w:tc>
+        <w:tc>
+          <w:tcPr>
+            <w:tcW w:type="dxa" w:w="6236"/>
+          </w:tcPr>
+          <w:p>
+            <w:r/>
+            <w:r>
+              <w:rPr>
+                <w:b w:val="0"/>
+                <w:sz w:val="20"/>
+              </w:rPr>
+              <w:t>Après une erreur, l'écran de génération recharge le lot de lui-même : plus besoin de recharger la page.</w:t>
+            </w:r>
+          </w:p>
+        </w:tc>
+        <w:tc>
+          <w:tcPr>
+            <w:tcW w:type="dxa" w:w="1247"/>
+          </w:tcPr>
+          <w:p>
+            <w:r/>
+            <w:r>
+              <w:rPr>
+                <w:b w:val="0"/>
+                <w:sz w:val="20"/>
+              </w:rPr>
+              <w:t>9.1</w:t>
+            </w:r>
+          </w:p>
+        </w:tc>
+      </w:tr>
+      <w:tr>
+        <w:tc>
+          <w:tcPr>
+            <w:tcW w:type="dxa" w:w="2041"/>
+          </w:tcPr>
+          <w:p>
+            <w:r/>
+            <w:r>
+              <w:rPr>
+                <w:b w:val="0"/>
+                <w:sz w:val="20"/>
+              </w:rPr>
+              <w:t>Fiche et aperçu de l'OM amendé</w:t>
+            </w:r>
+          </w:p>
+        </w:tc>
+        <w:tc>
+          <w:tcPr>
+            <w:tcW w:type="dxa" w:w="6236"/>
+          </w:tcPr>
+          <w:p>
+            <w:r/>
+            <w:r>
+              <w:rPr>
+                <w:b w:val="0"/>
+                <w:sz w:val="20"/>
+              </w:rPr>
+              <w:t>Ils affichent les mêmes libellés que le PDF officiel : « Avance engagée », « Reliquat (ajusté par amendement) » ou « Trop-perçu ».</w:t>
+            </w:r>
+          </w:p>
+        </w:tc>
+        <w:tc>
+          <w:tcPr>
+            <w:tcW w:type="dxa" w:w="1247"/>
+          </w:tcPr>
+          <w:p>
+            <w:r/>
+            <w:r>
+              <w:rPr>
+                <w:b w:val="0"/>
+                <w:sz w:val="20"/>
+              </w:rPr>
+              <w:t>6.3</w:t>
+            </w:r>
+          </w:p>
+        </w:tc>
+      </w:tr>
+      <w:tr>
+        <w:tc>
+          <w:tcPr>
+            <w:tcW w:type="dxa" w:w="2041"/>
+          </w:tcPr>
+          <w:p>
+            <w:r/>
+            <w:r>
+              <w:rPr>
+                <w:b w:val="0"/>
+                <w:sz w:val="20"/>
+              </w:rPr>
+              <w:t>Configuration e-mail</w:t>
+            </w:r>
+          </w:p>
+        </w:tc>
+        <w:tc>
+          <w:tcPr>
+            <w:tcW w:type="dxa" w:w="6236"/>
+          </w:tcPr>
+          <w:p>
+            <w:r/>
+            <w:r>
+              <w:rPr>
+                <w:b w:val="0"/>
+                <w:sz w:val="20"/>
+              </w:rPr>
+              <w:t>L'écran présente les notifications réellement envoyées, avec leurs destinataires.</w:t>
+            </w:r>
+          </w:p>
+        </w:tc>
+        <w:tc>
+          <w:tcPr>
+            <w:tcW w:type="dxa" w:w="1247"/>
+          </w:tcPr>
+          <w:p>
+            <w:r/>
+            <w:r>
+              <w:rPr>
+                <w:b w:val="0"/>
+                <w:sz w:val="20"/>
+              </w:rPr>
+              <w:t>13.2</w:t>
             </w:r>
           </w:p>
         </w:tc>
@@ -4339,6 +4527,58 @@
     </w:tbl>
     <w:p/>
     <w:p>
+      <w:pPr>
+        <w:jc w:val="center"/>
+      </w:pPr>
+      <w:r>
+        <w:drawing>
+          <wp:inline xmlns:a="http://schemas.openxmlformats.org/drawingml/2006/main" xmlns:pic="http://schemas.openxmlformats.org/drawingml/2006/picture">
+            <wp:extent cx="5760000" cy="10708000"/>
+            <wp:docPr id="2" name="Picture 2"/>
+            <wp:cNvGraphicFramePr>
+              <a:graphicFrameLocks noChangeAspect="1"/>
+            </wp:cNvGraphicFramePr>
+            <a:graphic>
+              <a:graphicData uri="http://schemas.openxmlformats.org/drawingml/2006/picture">
+                <pic:pic>
+                  <pic:nvPicPr>
+                    <pic:cNvPr id="0" name="33_gestion_roles.jpg"/>
+                    <pic:cNvPicPr/>
+                  </pic:nvPicPr>
+                  <pic:blipFill>
+                    <a:blip r:embed="rId10"/>
+                    <a:stretch>
+                      <a:fillRect/>
+                    </a:stretch>
+                  </pic:blipFill>
+                  <pic:spPr>
+                    <a:xfrm>
+                      <a:off x="0" y="0"/>
+                      <a:ext cx="5760000" cy="10708000"/>
+                    </a:xfrm>
+                    <a:prstGeom prst="rect"/>
+                  </pic:spPr>
+                </pic:pic>
+              </a:graphicData>
+            </a:graphic>
+          </wp:inline>
+        </w:drawing>
+      </w:r>
+    </w:p>
+    <w:p>
+      <w:pPr>
+        <w:jc w:val="center"/>
+      </w:pPr>
+      <w:r>
+        <w:rPr>
+          <w:i/>
+          <w:color w:val="4B5563"/>
+          <w:sz w:val="18"/>
+        </w:rPr>
+        <w:t>Figure — matrice des permissions</w:t>
+      </w:r>
+    </w:p>
+    <w:p>
       <w:r>
         <w:rPr>
           <w:b w:val="0"/>
@@ -4436,6 +4676,58 @@
     <w:p/>
     <w:p>
       <w:pPr>
+        <w:jc w:val="center"/>
+      </w:pPr>
+      <w:r>
+        <w:drawing>
+          <wp:inline xmlns:a="http://schemas.openxmlformats.org/drawingml/2006/main" xmlns:pic="http://schemas.openxmlformats.org/drawingml/2006/picture">
+            <wp:extent cx="5760000" cy="3600000"/>
+            <wp:docPr id="3" name="Picture 3"/>
+            <wp:cNvGraphicFramePr>
+              <a:graphicFrameLocks noChangeAspect="1"/>
+            </wp:cNvGraphicFramePr>
+            <a:graphic>
+              <a:graphicData uri="http://schemas.openxmlformats.org/drawingml/2006/picture">
+                <pic:pic>
+                  <pic:nvPicPr>
+                    <pic:cNvPr id="0" name="01_login.jpg"/>
+                    <pic:cNvPicPr/>
+                  </pic:nvPicPr>
+                  <pic:blipFill>
+                    <a:blip r:embed="rId11"/>
+                    <a:stretch>
+                      <a:fillRect/>
+                    </a:stretch>
+                  </pic:blipFill>
+                  <pic:spPr>
+                    <a:xfrm>
+                      <a:off x="0" y="0"/>
+                      <a:ext cx="5760000" cy="3600000"/>
+                    </a:xfrm>
+                    <a:prstGeom prst="rect"/>
+                  </pic:spPr>
+                </pic:pic>
+              </a:graphicData>
+            </a:graphic>
+          </wp:inline>
+        </w:drawing>
+      </w:r>
+    </w:p>
+    <w:p>
+      <w:pPr>
+        <w:jc w:val="center"/>
+      </w:pPr>
+      <w:r>
+        <w:rPr>
+          <w:i/>
+          <w:color w:val="4B5563"/>
+          <w:sz w:val="18"/>
+        </w:rPr>
+        <w:t>Figure — écran de connexion</w:t>
+      </w:r>
+    </w:p>
+    <w:p>
+      <w:pPr>
         <w:pStyle w:val="Heading2"/>
       </w:pPr>
       <w:r>
@@ -4550,6 +4842,58 @@
     </w:p>
     <w:p>
       <w:pPr>
+        <w:jc w:val="center"/>
+      </w:pPr>
+      <w:r>
+        <w:drawing>
+          <wp:inline xmlns:a="http://schemas.openxmlformats.org/drawingml/2006/main" xmlns:pic="http://schemas.openxmlformats.org/drawingml/2006/picture">
+            <wp:extent cx="5760000" cy="3600000"/>
+            <wp:docPr id="4" name="Picture 4"/>
+            <wp:cNvGraphicFramePr>
+              <a:graphicFrameLocks noChangeAspect="1"/>
+            </wp:cNvGraphicFramePr>
+            <a:graphic>
+              <a:graphicData uri="http://schemas.openxmlformats.org/drawingml/2006/picture">
+                <pic:pic>
+                  <pic:nvPicPr>
+                    <pic:cNvPr id="0" name="04_dashboard.jpg"/>
+                    <pic:cNvPicPr/>
+                  </pic:nvPicPr>
+                  <pic:blipFill>
+                    <a:blip r:embed="rId12"/>
+                    <a:stretch>
+                      <a:fillRect/>
+                    </a:stretch>
+                  </pic:blipFill>
+                  <pic:spPr>
+                    <a:xfrm>
+                      <a:off x="0" y="0"/>
+                      <a:ext cx="5760000" cy="3600000"/>
+                    </a:xfrm>
+                    <a:prstGeom prst="rect"/>
+                  </pic:spPr>
+                </pic:pic>
+              </a:graphicData>
+            </a:graphic>
+          </wp:inline>
+        </w:drawing>
+      </w:r>
+    </w:p>
+    <w:p>
+      <w:pPr>
+        <w:jc w:val="center"/>
+      </w:pPr>
+      <w:r>
+        <w:rPr>
+          <w:i/>
+          <w:color w:val="4B5563"/>
+          <w:sz w:val="18"/>
+        </w:rPr>
+        <w:t>Figure — tableau de bord (profil super administrateur)</w:t>
+      </w:r>
+    </w:p>
+    <w:p>
+      <w:pPr>
         <w:pStyle w:val="Heading1"/>
       </w:pPr>
       <w:r>
@@ -4575,6 +4919,58 @@
     </w:p>
     <w:p>
       <w:pPr>
+        <w:jc w:val="center"/>
+      </w:pPr>
+      <w:r>
+        <w:drawing>
+          <wp:inline xmlns:a="http://schemas.openxmlformats.org/drawingml/2006/main" xmlns:pic="http://schemas.openxmlformats.org/drawingml/2006/picture">
+            <wp:extent cx="5760000" cy="3892000"/>
+            <wp:docPr id="5" name="Picture 5"/>
+            <wp:cNvGraphicFramePr>
+              <a:graphicFrameLocks noChangeAspect="1"/>
+            </wp:cNvGraphicFramePr>
+            <a:graphic>
+              <a:graphicData uri="http://schemas.openxmlformats.org/drawingml/2006/picture">
+                <pic:pic>
+                  <pic:nvPicPr>
+                    <pic:cNvPr id="0" name="05_personnel_liste.jpg"/>
+                    <pic:cNvPicPr/>
+                  </pic:nvPicPr>
+                  <pic:blipFill>
+                    <a:blip r:embed="rId13"/>
+                    <a:stretch>
+                      <a:fillRect/>
+                    </a:stretch>
+                  </pic:blipFill>
+                  <pic:spPr>
+                    <a:xfrm>
+                      <a:off x="0" y="0"/>
+                      <a:ext cx="5760000" cy="3892000"/>
+                    </a:xfrm>
+                    <a:prstGeom prst="rect"/>
+                  </pic:spPr>
+                </pic:pic>
+              </a:graphicData>
+            </a:graphic>
+          </wp:inline>
+        </w:drawing>
+      </w:r>
+    </w:p>
+    <w:p>
+      <w:pPr>
+        <w:jc w:val="center"/>
+      </w:pPr>
+      <w:r>
+        <w:rPr>
+          <w:i/>
+          <w:color w:val="4B5563"/>
+          <w:sz w:val="18"/>
+        </w:rPr>
+        <w:t>Figure — liste du personnel</w:t>
+      </w:r>
+    </w:p>
+    <w:p>
+      <w:pPr>
         <w:pStyle w:val="ListBullet"/>
       </w:pPr>
       <w:r>
@@ -4789,6 +5185,58 @@
     </w:p>
     <w:p>
       <w:pPr>
+        <w:jc w:val="center"/>
+      </w:pPr>
+      <w:r>
+        <w:drawing>
+          <wp:inline xmlns:a="http://schemas.openxmlformats.org/drawingml/2006/main" xmlns:pic="http://schemas.openxmlformats.org/drawingml/2006/picture">
+            <wp:extent cx="5760000" cy="3740000"/>
+            <wp:docPr id="6" name="Picture 6"/>
+            <wp:cNvGraphicFramePr>
+              <a:graphicFrameLocks noChangeAspect="1"/>
+            </wp:cNvGraphicFramePr>
+            <a:graphic>
+              <a:graphicData uri="http://schemas.openxmlformats.org/drawingml/2006/picture">
+                <pic:pic>
+                  <pic:nvPicPr>
+                    <pic:cNvPr id="0" name="12_om_creation.jpg"/>
+                    <pic:cNvPicPr/>
+                  </pic:nvPicPr>
+                  <pic:blipFill>
+                    <a:blip r:embed="rId14"/>
+                    <a:stretch>
+                      <a:fillRect/>
+                    </a:stretch>
+                  </pic:blipFill>
+                  <pic:spPr>
+                    <a:xfrm>
+                      <a:off x="0" y="0"/>
+                      <a:ext cx="5760000" cy="3740000"/>
+                    </a:xfrm>
+                    <a:prstGeom prst="rect"/>
+                  </pic:spPr>
+                </pic:pic>
+              </a:graphicData>
+            </a:graphic>
+          </wp:inline>
+        </w:drawing>
+      </w:r>
+    </w:p>
+    <w:p>
+      <w:pPr>
+        <w:jc w:val="center"/>
+      </w:pPr>
+      <w:r>
+        <w:rPr>
+          <w:i/>
+          <w:color w:val="4B5563"/>
+          <w:sz w:val="18"/>
+        </w:rPr>
+        <w:t>Figure — assistant de retranscription, étape 1</w:t>
+      </w:r>
+    </w:p>
+    <w:p>
+      <w:pPr>
         <w:pStyle w:val="Heading3"/>
       </w:pPr>
       <w:r>
@@ -4938,6 +5386,58 @@
       </w:pPr>
       <w:r>
         <w:t>Le PDF de l'OM reprend les signatures de l'état des avances de sa mission, au fur et à mesure du circuit (contrôle, puis visa DAF, puis validation DG), avec le même code de vérification que l'état. Un OM rejeté n'en porte aucune, et un brouillon jamais. Le document de référence reste l'état de paiement.</w:t>
+      </w:r>
+    </w:p>
+    <w:p>
+      <w:pPr>
+        <w:jc w:val="center"/>
+      </w:pPr>
+      <w:r>
+        <w:drawing>
+          <wp:inline xmlns:a="http://schemas.openxmlformats.org/drawingml/2006/main" xmlns:pic="http://schemas.openxmlformats.org/drawingml/2006/picture">
+            <wp:extent cx="5760000" cy="4708000"/>
+            <wp:docPr id="7" name="Picture 7"/>
+            <wp:cNvGraphicFramePr>
+              <a:graphicFrameLocks noChangeAspect="1"/>
+            </wp:cNvGraphicFramePr>
+            <a:graphic>
+              <a:graphicData uri="http://schemas.openxmlformats.org/drawingml/2006/picture">
+                <pic:pic>
+                  <pic:nvPicPr>
+                    <pic:cNvPr id="0" name="15_detail_om.jpg"/>
+                    <pic:cNvPicPr/>
+                  </pic:nvPicPr>
+                  <pic:blipFill>
+                    <a:blip r:embed="rId15"/>
+                    <a:stretch>
+                      <a:fillRect/>
+                    </a:stretch>
+                  </pic:blipFill>
+                  <pic:spPr>
+                    <a:xfrm>
+                      <a:off x="0" y="0"/>
+                      <a:ext cx="5760000" cy="4708000"/>
+                    </a:xfrm>
+                    <a:prstGeom prst="rect"/>
+                  </pic:spPr>
+                </pic:pic>
+              </a:graphicData>
+            </a:graphic>
+          </wp:inline>
+        </w:drawing>
+      </w:r>
+    </w:p>
+    <w:p>
+      <w:pPr>
+        <w:jc w:val="center"/>
+      </w:pPr>
+      <w:r>
+        <w:rPr>
+          <w:i/>
+          <w:color w:val="4B5563"/>
+          <w:sz w:val="18"/>
+        </w:rPr>
+        <w:t>Figure — fiche d'un OM amendé après paiement de l'avance (trop-perçu)</w:t>
       </w:r>
     </w:p>
     <w:p>
@@ -5109,7 +5609,7 @@
         <w:pStyle w:val="ListBullet"/>
       </w:pPr>
       <w:r>
-        <w:t>Le PDF de l'OM (lien « PDF de l'OM » en haut de la fiche) est régénéré après l'amendement. Il n'affiche plus « Avance (70 %) / Reliquat (30 %) » mais « Avance engagée », puis « Reliquat (ajusté par amendement) » ou, en cas de réduction forte, « Trop-perçu (à recouvrer par retenue sur salaire) » avec un montant négatif et la mention « Montant total dû ». Un encadré rappelle l'amendement : date, nombre de jours avant et après, motif.</w:t>
+        <w:t>La fiche de l'OM, l'aperçu « PDF de l'OM » et le PDF officiel (régénéré après l'amendement) n'affichent plus « Avance (70 %) / Reliquat (30 %) » mais « Avance engagée », puis « Reliquat (ajusté par amendement) » ou, en cas de réduction forte, « Trop-perçu (à recouvrer par retenue sur salaire) » avec un montant négatif et la mention « Montant total dû ». Un encadré rappelle l'amendement : date, nombre de jours avant et après, motif.</w:t>
       </w:r>
     </w:p>
     <w:p>
@@ -5211,6 +5711,58 @@
       </w:pPr>
       <w:r>
         <w:t>La tranche Reliquats n'est proposée qu'après validation de l'état des avances.</w:t>
+      </w:r>
+    </w:p>
+    <w:p>
+      <w:pPr>
+        <w:jc w:val="center"/>
+      </w:pPr>
+      <w:r>
+        <w:drawing>
+          <wp:inline xmlns:a="http://schemas.openxmlformats.org/drawingml/2006/main" xmlns:pic="http://schemas.openxmlformats.org/drawingml/2006/picture">
+            <wp:extent cx="5760000" cy="3600000"/>
+            <wp:docPr id="8" name="Picture 8"/>
+            <wp:cNvGraphicFramePr>
+              <a:graphicFrameLocks noChangeAspect="1"/>
+            </wp:cNvGraphicFramePr>
+            <a:graphic>
+              <a:graphicData uri="http://schemas.openxmlformats.org/drawingml/2006/picture">
+                <pic:pic>
+                  <pic:nvPicPr>
+                    <pic:cNvPr id="0" name="18_file_etats.jpg"/>
+                    <pic:cNvPicPr/>
+                  </pic:nvPicPr>
+                  <pic:blipFill>
+                    <a:blip r:embed="rId16"/>
+                    <a:stretch>
+                      <a:fillRect/>
+                    </a:stretch>
+                  </pic:blipFill>
+                  <pic:spPr>
+                    <a:xfrm>
+                      <a:off x="0" y="0"/>
+                      <a:ext cx="5760000" cy="3600000"/>
+                    </a:xfrm>
+                    <a:prstGeom prst="rect"/>
+                  </pic:spPr>
+                </pic:pic>
+              </a:graphicData>
+            </a:graphic>
+          </wp:inline>
+        </w:drawing>
+      </w:r>
+    </w:p>
+    <w:p>
+      <w:pPr>
+        <w:jc w:val="center"/>
+      </w:pPr>
+      <w:r>
+        <w:rPr>
+          <w:i/>
+          <w:color w:val="4B5563"/>
+          <w:sz w:val="18"/>
+        </w:rPr>
+        <w:t>Figure — file de travail des états de paiement (profil contrôleur)</w:t>
       </w:r>
     </w:p>
     <w:p>
@@ -5539,7 +6091,59 @@
         <w:pStyle w:val="ListBullet"/>
       </w:pPr>
       <w:r>
-        <w:t>Notifications : à chaque étape, les comptes actifs du profil attendu reçoivent une notification (cloche et e-mail) ; à la validation finale, l'agent financier est prévenu ; en cas de rejet, le gestionnaire. Un compte désactivé n'est jamais notifié.</w:t>
+        <w:t>Notifications (cloche et e-mail) : à chaque étape, sont prévenus les comptes actifs qui détiennent la permission de l'étape suivante — contrôler, viser, puis valider ; à la validation finale, ceux qui génèrent les fichiers de paiement ; en cas de rejet, ceux qui retranscrivent les missions. Un rôle personnalisé ou un droit accordé à titre individuel est donc notifié ; un droit retiré ne l'est plus. Le super administrateur n'est pas notifié, et un compte désactivé ne l'est jamais.</w:t>
+      </w:r>
+    </w:p>
+    <w:p>
+      <w:pPr>
+        <w:jc w:val="center"/>
+      </w:pPr>
+      <w:r>
+        <w:drawing>
+          <wp:inline xmlns:a="http://schemas.openxmlformats.org/drawingml/2006/main" xmlns:pic="http://schemas.openxmlformats.org/drawingml/2006/picture">
+            <wp:extent cx="5760000" cy="4312000"/>
+            <wp:docPr id="9" name="Picture 9"/>
+            <wp:cNvGraphicFramePr>
+              <a:graphicFrameLocks noChangeAspect="1"/>
+            </wp:cNvGraphicFramePr>
+            <a:graphic>
+              <a:graphicData uri="http://schemas.openxmlformats.org/drawingml/2006/picture">
+                <pic:pic>
+                  <pic:nvPicPr>
+                    <pic:cNvPr id="0" name="17_etat_paiement.jpg"/>
+                    <pic:cNvPicPr/>
+                  </pic:nvPicPr>
+                  <pic:blipFill>
+                    <a:blip r:embed="rId17"/>
+                    <a:stretch>
+                      <a:fillRect/>
+                    </a:stretch>
+                  </pic:blipFill>
+                  <pic:spPr>
+                    <a:xfrm>
+                      <a:off x="0" y="0"/>
+                      <a:ext cx="5760000" cy="4312000"/>
+                    </a:xfrm>
+                    <a:prstGeom prst="rect"/>
+                  </pic:spPr>
+                </pic:pic>
+              </a:graphicData>
+            </a:graphic>
+          </wp:inline>
+        </w:drawing>
+      </w:r>
+    </w:p>
+    <w:p>
+      <w:pPr>
+        <w:jc w:val="center"/>
+      </w:pPr>
+      <w:r>
+        <w:rPr>
+          <w:i/>
+          <w:color w:val="4B5563"/>
+          <w:sz w:val="18"/>
+        </w:rPr>
+        <w:t>Figure — état des avances validé : numéro, montants et circuit signé</w:t>
       </w:r>
     </w:p>
     <w:tbl>
@@ -5890,7 +6494,59 @@
           <w:b w:val="0"/>
           <w:i w:val="0"/>
         </w:rPr>
-        <w:t>Pour un volume important (plus de 50 bénéficiaires), la génération peut se faire en arrière-plan : un bandeau de suivi s'affiche et le fichier se télécharge automatiquement dès qu'il est prêt. Restez sur l'écran pendant le traitement ; le lot reste ensuite re-téléchargeable depuis la liste des lots. Sur l'hébergement de production, le traitement se fait d'un seul tenant : si une erreur s'affiche, rechargez la page avant toute autre action, car un lot précédemment généré peut être passé en erreur.</w:t>
+        <w:t>Pour un volume important (plus de 50 bénéficiaires), la génération peut se faire en arrière-plan : un bandeau de suivi s'affiche et le fichier se télécharge automatiquement dès qu'il est prêt. Restez sur l'écran pendant le traitement ; le lot reste ensuite re-téléchargeable depuis la liste des lots. Sur l'hébergement de production, le traitement se fait d'un seul tenant : si une erreur s'affiche, l'écran recharge le lot de lui-même. Un lot précédemment généré a pu passer en erreur : « Confirmer le paiement » n'est alors plus proposé et « Régénérer » reste disponible.</w:t>
+      </w:r>
+    </w:p>
+    <w:p>
+      <w:pPr>
+        <w:jc w:val="center"/>
+      </w:pPr>
+      <w:r>
+        <w:drawing>
+          <wp:inline xmlns:a="http://schemas.openxmlformats.org/drawingml/2006/main" xmlns:pic="http://schemas.openxmlformats.org/drawingml/2006/picture">
+            <wp:extent cx="5760000" cy="3600000"/>
+            <wp:docPr id="10" name="Picture 10"/>
+            <wp:cNvGraphicFramePr>
+              <a:graphicFrameLocks noChangeAspect="1"/>
+            </wp:cNvGraphicFramePr>
+            <a:graphic>
+              <a:graphicData uri="http://schemas.openxmlformats.org/drawingml/2006/picture">
+                <pic:pic>
+                  <pic:nvPicPr>
+                    <pic:cNvPr id="0" name="19_generation_mtn.jpg"/>
+                    <pic:cNvPicPr/>
+                  </pic:nvPicPr>
+                  <pic:blipFill>
+                    <a:blip r:embed="rId18"/>
+                    <a:stretch>
+                      <a:fillRect/>
+                    </a:stretch>
+                  </pic:blipFill>
+                  <pic:spPr>
+                    <a:xfrm>
+                      <a:off x="0" y="0"/>
+                      <a:ext cx="5760000" cy="3600000"/>
+                    </a:xfrm>
+                    <a:prstGeom prst="rect"/>
+                  </pic:spPr>
+                </pic:pic>
+              </a:graphicData>
+            </a:graphic>
+          </wp:inline>
+        </w:drawing>
+      </w:r>
+    </w:p>
+    <w:p>
+      <w:pPr>
+        <w:jc w:val="center"/>
+      </w:pPr>
+      <w:r>
+        <w:rPr>
+          <w:i/>
+          <w:color w:val="4B5563"/>
+          <w:sz w:val="18"/>
+        </w:rPr>
+        <w:t>Figure — génération MTN : aperçu des bénéficiaires et lot généré, en attente de dépôt</w:t>
       </w:r>
     </w:p>
     <w:p>
@@ -6098,6 +6754,58 @@
       </w:r>
     </w:p>
     <w:p>
+      <w:pPr>
+        <w:jc w:val="center"/>
+      </w:pPr>
+      <w:r>
+        <w:drawing>
+          <wp:inline xmlns:a="http://schemas.openxmlformats.org/drawingml/2006/main" xmlns:pic="http://schemas.openxmlformats.org/drawingml/2006/picture">
+            <wp:extent cx="5760000" cy="3600000"/>
+            <wp:docPr id="11" name="Picture 11"/>
+            <wp:cNvGraphicFramePr>
+              <a:graphicFrameLocks noChangeAspect="1"/>
+            </wp:cNvGraphicFramePr>
+            <a:graphic>
+              <a:graphicData uri="http://schemas.openxmlformats.org/drawingml/2006/picture">
+                <pic:pic>
+                  <pic:nvPicPr>
+                    <pic:cNvPr id="0" name="47_regularisations.jpg"/>
+                    <pic:cNvPicPr/>
+                  </pic:nvPicPr>
+                  <pic:blipFill>
+                    <a:blip r:embed="rId19"/>
+                    <a:stretch>
+                      <a:fillRect/>
+                    </a:stretch>
+                  </pic:blipFill>
+                  <pic:spPr>
+                    <a:xfrm>
+                      <a:off x="0" y="0"/>
+                      <a:ext cx="5760000" cy="3600000"/>
+                    </a:xfrm>
+                    <a:prstGeom prst="rect"/>
+                  </pic:spPr>
+                </pic:pic>
+              </a:graphicData>
+            </a:graphic>
+          </wp:inline>
+        </w:drawing>
+      </w:r>
+    </w:p>
+    <w:p>
+      <w:pPr>
+        <w:jc w:val="center"/>
+      </w:pPr>
+      <w:r>
+        <w:rPr>
+          <w:i/>
+          <w:color w:val="4B5563"/>
+          <w:sz w:val="18"/>
+        </w:rPr>
+        <w:t>Figure — régularisations : un trop-perçu à recouvrer</w:t>
+      </w:r>
+    </w:p>
+    <w:p>
       <w:r>
         <w:rPr>
           <w:b w:val="0"/>
@@ -6161,7 +6869,7 @@
         <w:pStyle w:val="ListBullet"/>
       </w:pPr>
       <w:r>
-        <w:t>Rapport mensuel : synthèse par opérateur, par tranche et par statut.</w:t>
+        <w:t>Rapport mensuel : synthèse par opérateur, par tranche et par statut. Un paiement est rangé dans le mois de sa confirmation, à l'heure du Bénin.</w:t>
       </w:r>
     </w:p>
     <w:p>
@@ -6186,6 +6894,58 @@
       </w:pPr>
       <w:r>
         <w:t>Export Excel ou PDF (immédiat ou en arrière-plan pour les gros volumes).</w:t>
+      </w:r>
+    </w:p>
+    <w:p>
+      <w:pPr>
+        <w:jc w:val="center"/>
+      </w:pPr>
+      <w:r>
+        <w:drawing>
+          <wp:inline xmlns:a="http://schemas.openxmlformats.org/drawingml/2006/main" xmlns:pic="http://schemas.openxmlformats.org/drawingml/2006/picture">
+            <wp:extent cx="5760000" cy="3600000"/>
+            <wp:docPr id="12" name="Picture 12"/>
+            <wp:cNvGraphicFramePr>
+              <a:graphicFrameLocks noChangeAspect="1"/>
+            </wp:cNvGraphicFramePr>
+            <a:graphic>
+              <a:graphicData uri="http://schemas.openxmlformats.org/drawingml/2006/picture">
+                <pic:pic>
+                  <pic:nvPicPr>
+                    <pic:cNvPr id="0" name="26_rapport_mensuel.jpg"/>
+                    <pic:cNvPicPr/>
+                  </pic:nvPicPr>
+                  <pic:blipFill>
+                    <a:blip r:embed="rId20"/>
+                    <a:stretch>
+                      <a:fillRect/>
+                    </a:stretch>
+                  </pic:blipFill>
+                  <pic:spPr>
+                    <a:xfrm>
+                      <a:off x="0" y="0"/>
+                      <a:ext cx="5760000" cy="3600000"/>
+                    </a:xfrm>
+                    <a:prstGeom prst="rect"/>
+                  </pic:spPr>
+                </pic:pic>
+              </a:graphicData>
+            </a:graphic>
+          </wp:inline>
+        </w:drawing>
+      </w:r>
+    </w:p>
+    <w:p>
+      <w:pPr>
+        <w:jc w:val="center"/>
+      </w:pPr>
+      <w:r>
+        <w:rPr>
+          <w:i/>
+          <w:color w:val="4B5563"/>
+          <w:sz w:val="18"/>
+        </w:rPr>
+        <w:t>Figure — état mensuel</w:t>
       </w:r>
     </w:p>
     <w:p>
@@ -6286,6 +7046,58 @@
         <w:t>On ne peut pas désactiver ou supprimer son propre compte.</w:t>
       </w:r>
     </w:p>
+    <w:p>
+      <w:pPr>
+        <w:jc w:val="center"/>
+      </w:pPr>
+      <w:r>
+        <w:drawing>
+          <wp:inline xmlns:a="http://schemas.openxmlformats.org/drawingml/2006/main" xmlns:pic="http://schemas.openxmlformats.org/drawingml/2006/picture">
+            <wp:extent cx="5760000" cy="5284000"/>
+            <wp:docPr id="13" name="Picture 13"/>
+            <wp:cNvGraphicFramePr>
+              <a:graphicFrameLocks noChangeAspect="1"/>
+            </wp:cNvGraphicFramePr>
+            <a:graphic>
+              <a:graphicData uri="http://schemas.openxmlformats.org/drawingml/2006/picture">
+                <pic:pic>
+                  <pic:nvPicPr>
+                    <pic:cNvPr id="0" name="31_gestion_utilisateurs.jpg"/>
+                    <pic:cNvPicPr/>
+                  </pic:nvPicPr>
+                  <pic:blipFill>
+                    <a:blip r:embed="rId21"/>
+                    <a:stretch>
+                      <a:fillRect/>
+                    </a:stretch>
+                  </pic:blipFill>
+                  <pic:spPr>
+                    <a:xfrm>
+                      <a:off x="0" y="0"/>
+                      <a:ext cx="5760000" cy="5284000"/>
+                    </a:xfrm>
+                    <a:prstGeom prst="rect"/>
+                  </pic:spPr>
+                </pic:pic>
+              </a:graphicData>
+            </a:graphic>
+          </wp:inline>
+        </w:drawing>
+      </w:r>
+    </w:p>
+    <w:p>
+      <w:pPr>
+        <w:jc w:val="center"/>
+      </w:pPr>
+      <w:r>
+        <w:rPr>
+          <w:i/>
+          <w:color w:val="4B5563"/>
+          <w:sz w:val="18"/>
+        </w:rPr>
+        <w:t>Figure — gestion des utilisateurs</w:t>
+      </w:r>
+    </w:p>
     <w:tbl>
       <w:tblPr>
         <w:tblW w:type="auto" w:w="0"/>
@@ -6350,7 +7162,7 @@
         <w:pStyle w:val="ListBullet"/>
       </w:pPr>
       <w:r>
-        <w:t>Paramètres : configuration générale de l'application, dont la part de l'avance (%) appliquée à la répartition avance / reliquat (70 % par défaut).</w:t>
+        <w:t>Paramètres : configuration générale de l'application, dont la part de l'avance (%) appliquée à la répartition avance / reliquat (70 % par défaut). Le fuseau horaire (heure du Bénin) y est affiché pour information : il est réglé sur le serveur.</w:t>
       </w:r>
     </w:p>
     <w:p>
@@ -6366,7 +7178,7 @@
         <w:pStyle w:val="ListBullet"/>
       </w:pPr>
       <w:r>
-        <w:t>Configuration e-mail (SMTP) : le mot de passe est stocké chiffré et n'est jamais réaffiché en clair.</w:t>
+        <w:t>Configuration e-mail (SMTP) : le mot de passe est stocké chiffré et n'est jamais réaffiché en clair. L'écran liste les sept notifications envoyées (état à signer, état validé ou rejeté, OM validé ou rejeté, lot confirmé, trop-perçu créé) avec la permission de leurs destinataires.</w:t>
       </w:r>
     </w:p>
     <w:p>

</xml_diff>

<commit_message>
docs(guide) : part de l'avance d'une mission dans le guide utilisateur
Nouveauté 1.4 et chapitres 7.1, 8, 9.1, 13 : les écrans d'une mission
existante (état de paiement, choix de la tranche à la génération)
affichent la part de ses OM ; changer la part dans Paramètres ne vaut que
pour les OM saisis ensuite. Guide .docx régénéré.

Co-Authored-By: Claude Opus 5.5 <noreply@anthropic.com>
Claude-Session: https://claude.ai/code/session_01MUfkbbz4qHVd6KNyyZzHX8
</commit_message>
<xml_diff>
--- a/docs/Guide-Utilisateur-ANaTT.docx
+++ b/docs/Guide-Utilisateur-ANaTT.docx
@@ -1372,6 +1372,53 @@
                 <w:b w:val="0"/>
                 <w:sz w:val="20"/>
               </w:rPr>
+              <w:t>Part de l'avance d'une mission</w:t>
+            </w:r>
+          </w:p>
+        </w:tc>
+        <w:tc>
+          <w:tcPr>
+            <w:tcW w:type="dxa" w:w="6236"/>
+          </w:tcPr>
+          <w:p>
+            <w:r/>
+            <w:r>
+              <w:rPr>
+                <w:b w:val="0"/>
+                <w:sz w:val="20"/>
+              </w:rPr>
+              <w:t>L'écran d'un état de paiement (« Avances (70 %) » / « Reliquats (30 %) ») et le choix de la tranche à la génération affichent la part avec laquelle les OM de la mission ont été retranscrits, et non le réglage du jour : changer la part dans « Paramètres » ne modifie ni les montants ni les pourcentages d'une mission déjà saisie.</w:t>
+            </w:r>
+          </w:p>
+        </w:tc>
+        <w:tc>
+          <w:tcPr>
+            <w:tcW w:type="dxa" w:w="1247"/>
+          </w:tcPr>
+          <w:p>
+            <w:r/>
+            <w:r>
+              <w:rPr>
+                <w:b w:val="0"/>
+                <w:sz w:val="20"/>
+              </w:rPr>
+              <w:t>7.1, 8, 9.1</w:t>
+            </w:r>
+          </w:p>
+        </w:tc>
+      </w:tr>
+      <w:tr>
+        <w:tc>
+          <w:tcPr>
+            <w:tcW w:type="dxa" w:w="2041"/>
+          </w:tcPr>
+          <w:p>
+            <w:r/>
+            <w:r>
+              <w:rPr>
+                <w:b w:val="0"/>
+                <w:sz w:val="20"/>
+              </w:rPr>
               <w:t>Fonction imprimée</w:t>
             </w:r>
           </w:p>
@@ -5715,6 +5762,14 @@
     </w:p>
     <w:p>
       <w:pPr>
+        <w:pStyle w:val="ListBullet"/>
+      </w:pPr>
+      <w:r>
+        <w:t>Les onglets « Avances (… %) » et « Reliquats (… %) » indiquent la part de l'avance de la mission, celle avec laquelle ses OM ont été retranscrits : elle ne change pas si la part est modifiée ensuite dans « Paramètres ».</w:t>
+      </w:r>
+    </w:p>
+    <w:p>
+      <w:pPr>
         <w:jc w:val="center"/>
       </w:pPr>
       <w:r>
@@ -6364,7 +6419,7 @@
         <w:pStyle w:val="ListBullet"/>
       </w:pPr>
       <w:r>
-        <w:t>Avance = arrondi de (montant total × part de l'avance). La part est de 70 % par défaut et se règle dans les Paramètres (SUPER_ADMIN) ; elle s'applique aux OM retranscrits ensuite.</w:t>
+        <w:t>Avance = arrondi de (montant total × part de l'avance). La part est de 70 % par défaut et se règle dans les Paramètres (SUPER_ADMIN) ; elle s'applique aux OM retranscrits ensuite. Une mission déjà saisie garde ses montants, et ses écrans (fiche et PDF de l'OM, état de paiement, génération des fichiers) affichent la part avec laquelle elle a été retranscrite.</w:t>
       </w:r>
     </w:p>
     <w:p>
@@ -6473,7 +6528,7 @@
         </w:numPr>
       </w:pPr>
       <w:r>
-        <w:t>Sélectionnez la mission et la tranche (AVANCE ou RELIQUAT) : l'« Aperçu des bénéficiaires » éligibles s'affiche aussitôt.</w:t>
+        <w:t>Sélectionnez la mission et la tranche (AVANCE ou RELIQUAT) : l'« Aperçu des bénéficiaires » éligibles s'affiche aussitôt. Une fois la mission choisie, la tranche est libellée avec la part de cette mission (par exemple « Avance (60 %) » pour une mission retranscrite à 60 %).</w:t>
       </w:r>
     </w:p>
     <w:p>
@@ -7162,7 +7217,7 @@
         <w:pStyle w:val="ListBullet"/>
       </w:pPr>
       <w:r>
-        <w:t>Paramètres : configuration générale de l'application, dont la part de l'avance (%) appliquée à la répartition avance / reliquat (70 % par défaut). Le fuseau horaire (heure du Bénin) y est affiché pour information : il est réglé sur le serveur.</w:t>
+        <w:t>Paramètres (onglet Général) : configuration générale de l'application, dont la part de l'avance (%) appliquée à la répartition avance / reliquat (70 % par défaut). Elle ne vaut que pour les OM retranscrits après la modification : les missions déjà saisies gardent leurs montants et leur part. Le fuseau horaire (heure du Bénin) y est affiché pour information : il est réglé sur le serveur.</w:t>
       </w:r>
     </w:p>
     <w:p>

</xml_diff>

<commit_message>
Guide utilisateur : erreur passagère, maintenance, écran e-mail
- §3.4 « Erreur momentanée du serveur, maintenance » : la session est
  conservée, « Réessayer » ramène à la page demandée ; seule une session
  réellement expirée renvoie à la connexion ;
- nouveauté 1.4 « Erreur passagère » ;
- capture de l'écran Configuration e-mail (serveur, expéditeur, e-mail
  de test) au §13.2.

.docx régénéré ; CHANGELOG mis à jour.

Co-Authored-By: Claude Opus 5.5 <noreply@anthropic.com>
Claude-Session: https://claude.ai/code/session_01MUfkbbz4qHVd6KNyyZzHX8
</commit_message>
<xml_diff>
--- a/docs/Guide-Utilisateur-ANaTT.docx
+++ b/docs/Guide-Utilisateur-ANaTT.docx
@@ -1419,6 +1419,53 @@
                 <w:b w:val="0"/>
                 <w:sz w:val="20"/>
               </w:rPr>
+              <w:t>Erreur passagère</w:t>
+            </w:r>
+          </w:p>
+        </w:tc>
+        <w:tc>
+          <w:tcPr>
+            <w:tcW w:type="dxa" w:w="6236"/>
+          </w:tcPr>
+          <w:p>
+            <w:r/>
+            <w:r>
+              <w:rPr>
+                <w:b w:val="0"/>
+                <w:sz w:val="20"/>
+              </w:rPr>
+              <w:t>Un incident momentané du serveur (trop de requêtes, erreur, coupure réseau) au rechargement d'une page ne vous déconnecte plus : l'écran d'erreur s'affiche et « Réessayer » vous ramène à la page demandée, toujours connecté.</w:t>
+            </w:r>
+          </w:p>
+        </w:tc>
+        <w:tc>
+          <w:tcPr>
+            <w:tcW w:type="dxa" w:w="1247"/>
+          </w:tcPr>
+          <w:p>
+            <w:r/>
+            <w:r>
+              <w:rPr>
+                <w:b w:val="0"/>
+                <w:sz w:val="20"/>
+              </w:rPr>
+              <w:t>3.4</w:t>
+            </w:r>
+          </w:p>
+        </w:tc>
+      </w:tr>
+      <w:tr>
+        <w:tc>
+          <w:tcPr>
+            <w:tcW w:type="dxa" w:w="2041"/>
+          </w:tcPr>
+          <w:p>
+            <w:r/>
+            <w:r>
+              <w:rPr>
+                <w:b w:val="0"/>
+                <w:sz w:val="20"/>
+              </w:rPr>
               <w:t>Saisie d'une mission</w:t>
             </w:r>
           </w:p>
@@ -4966,6 +5013,56 @@
     </w:p>
     <w:p>
       <w:pPr>
+        <w:pStyle w:val="Heading2"/>
+      </w:pPr>
+      <w:r>
+        <w:t>3.4 Erreur momentanée du serveur, maintenance</w:t>
+      </w:r>
+    </w:p>
+    <w:p>
+      <w:r>
+        <w:rPr>
+          <w:b w:val="0"/>
+          <w:i w:val="0"/>
+        </w:rPr>
+        <w:t>Si le serveur ne répond pas correctement au moment où vous ouvrez ou rechargez une page (trop de requêtes en peu de temps, erreur passagère, coupure du réseau), l'application affiche l'écran « Erreur serveur » au lieu de la page demandée. Votre session est conservée : vous n'avez pas à vous reconnecter.</w:t>
+      </w:r>
+    </w:p>
+    <w:p>
+      <w:pPr>
+        <w:pStyle w:val="ListNumber"/>
+        <w:numPr>
+          <w:ilvl w:val="0"/>
+          <w:numId w:val="14"/>
+        </w:numPr>
+      </w:pPr>
+      <w:r>
+        <w:t>Patientez quelques instants (une minute au plus après « Trop de tentatives »).</w:t>
+      </w:r>
+    </w:p>
+    <w:p>
+      <w:pPr>
+        <w:pStyle w:val="ListNumber"/>
+        <w:numPr>
+          <w:ilvl w:val="0"/>
+          <w:numId w:val="14"/>
+        </w:numPr>
+      </w:pPr>
+      <w:r>
+        <w:t>Cliquez sur « Réessayer » : l'application vous ramène à la page que vous vouliez ouvrir.</w:t>
+      </w:r>
+    </w:p>
+    <w:p>
+      <w:r>
+        <w:rPr>
+          <w:b w:val="0"/>
+          <w:i w:val="0"/>
+        </w:rPr>
+        <w:t>Pendant une mise à jour ou lorsque le super administrateur active le mode maintenance, l'écran « Maintenance en cours » s'affiche ; il revient de lui-même à votre page dès que le service reprend. Seule une session réellement expirée (durée de session dépassée, compte désactivé, mot de passe réinitialisé) vous renvoie à l'écran de connexion.</w:t>
+      </w:r>
+    </w:p>
+    <w:p>
+      <w:pPr>
         <w:pStyle w:val="Heading1"/>
       </w:pPr>
       <w:r>
@@ -5156,7 +5253,7 @@
         <w:pStyle w:val="ListNumber"/>
         <w:numPr>
           <w:ilvl w:val="0"/>
-          <w:numId w:val="14"/>
+          <w:numId w:val="15"/>
         </w:numPr>
       </w:pPr>
       <w:r>
@@ -5168,7 +5265,7 @@
         <w:pStyle w:val="ListNumber"/>
         <w:numPr>
           <w:ilvl w:val="0"/>
-          <w:numId w:val="14"/>
+          <w:numId w:val="15"/>
         </w:numPr>
       </w:pPr>
       <w:r>
@@ -5180,7 +5277,7 @@
         <w:pStyle w:val="ListNumber"/>
         <w:numPr>
           <w:ilvl w:val="0"/>
-          <w:numId w:val="14"/>
+          <w:numId w:val="15"/>
         </w:numPr>
       </w:pPr>
       <w:r>
@@ -5192,7 +5289,7 @@
         <w:pStyle w:val="ListNumber"/>
         <w:numPr>
           <w:ilvl w:val="0"/>
-          <w:numId w:val="14"/>
+          <w:numId w:val="15"/>
         </w:numPr>
       </w:pPr>
       <w:r>
@@ -5212,7 +5309,7 @@
         <w:pStyle w:val="ListNumber"/>
         <w:numPr>
           <w:ilvl w:val="0"/>
-          <w:numId w:val="15"/>
+          <w:numId w:val="16"/>
         </w:numPr>
       </w:pPr>
       <w:r>
@@ -5224,7 +5321,7 @@
         <w:pStyle w:val="ListNumber"/>
         <w:numPr>
           <w:ilvl w:val="0"/>
-          <w:numId w:val="15"/>
+          <w:numId w:val="16"/>
         </w:numPr>
       </w:pPr>
       <w:r>
@@ -5236,7 +5333,7 @@
         <w:pStyle w:val="ListNumber"/>
         <w:numPr>
           <w:ilvl w:val="0"/>
-          <w:numId w:val="15"/>
+          <w:numId w:val="16"/>
         </w:numPr>
       </w:pPr>
       <w:r>
@@ -5248,7 +5345,7 @@
         <w:pStyle w:val="ListNumber"/>
         <w:numPr>
           <w:ilvl w:val="0"/>
-          <w:numId w:val="15"/>
+          <w:numId w:val="16"/>
         </w:numPr>
       </w:pPr>
       <w:r>
@@ -5647,7 +5744,7 @@
         <w:pStyle w:val="ListNumber"/>
         <w:numPr>
           <w:ilvl w:val="0"/>
-          <w:numId w:val="16"/>
+          <w:numId w:val="17"/>
         </w:numPr>
       </w:pPr>
       <w:r>
@@ -5659,7 +5756,7 @@
         <w:pStyle w:val="ListNumber"/>
         <w:numPr>
           <w:ilvl w:val="0"/>
-          <w:numId w:val="16"/>
+          <w:numId w:val="17"/>
         </w:numPr>
       </w:pPr>
       <w:r>
@@ -5671,7 +5768,7 @@
         <w:pStyle w:val="ListNumber"/>
         <w:numPr>
           <w:ilvl w:val="0"/>
-          <w:numId w:val="16"/>
+          <w:numId w:val="17"/>
         </w:numPr>
       </w:pPr>
       <w:r>
@@ -6606,7 +6703,7 @@
         <w:pStyle w:val="ListNumber"/>
         <w:numPr>
           <w:ilvl w:val="0"/>
-          <w:numId w:val="17"/>
+          <w:numId w:val="18"/>
         </w:numPr>
       </w:pPr>
       <w:r>
@@ -6618,7 +6715,7 @@
         <w:pStyle w:val="ListNumber"/>
         <w:numPr>
           <w:ilvl w:val="0"/>
-          <w:numId w:val="17"/>
+          <w:numId w:val="18"/>
         </w:numPr>
       </w:pPr>
       <w:r>
@@ -6630,7 +6727,7 @@
         <w:pStyle w:val="ListNumber"/>
         <w:numPr>
           <w:ilvl w:val="0"/>
-          <w:numId w:val="17"/>
+          <w:numId w:val="18"/>
         </w:numPr>
       </w:pPr>
       <w:r>
@@ -6711,7 +6808,7 @@
         <w:pStyle w:val="ListNumber"/>
         <w:numPr>
           <w:ilvl w:val="0"/>
-          <w:numId w:val="18"/>
+          <w:numId w:val="19"/>
         </w:numPr>
       </w:pPr>
       <w:r>
@@ -6723,7 +6820,7 @@
         <w:pStyle w:val="ListNumber"/>
         <w:numPr>
           <w:ilvl w:val="0"/>
-          <w:numId w:val="18"/>
+          <w:numId w:val="19"/>
         </w:numPr>
       </w:pPr>
       <w:r>
@@ -6735,7 +6832,7 @@
         <w:pStyle w:val="ListNumber"/>
         <w:numPr>
           <w:ilvl w:val="0"/>
-          <w:numId w:val="18"/>
+          <w:numId w:val="19"/>
         </w:numPr>
       </w:pPr>
       <w:r>
@@ -6871,7 +6968,7 @@
         <w:pStyle w:val="ListNumber"/>
         <w:numPr>
           <w:ilvl w:val="0"/>
-          <w:numId w:val="19"/>
+          <w:numId w:val="20"/>
         </w:numPr>
       </w:pPr>
       <w:r>
@@ -6883,7 +6980,7 @@
         <w:pStyle w:val="ListNumber"/>
         <w:numPr>
           <w:ilvl w:val="0"/>
-          <w:numId w:val="19"/>
+          <w:numId w:val="20"/>
         </w:numPr>
       </w:pPr>
       <w:r>
@@ -6895,7 +6992,7 @@
         <w:pStyle w:val="ListNumber"/>
         <w:numPr>
           <w:ilvl w:val="0"/>
-          <w:numId w:val="19"/>
+          <w:numId w:val="20"/>
         </w:numPr>
       </w:pPr>
       <w:r>
@@ -7738,6 +7835,58 @@
     </w:p>
     <w:p>
       <w:pPr>
+        <w:jc w:val="center"/>
+      </w:pPr>
+      <w:r>
+        <w:drawing>
+          <wp:inline xmlns:a="http://schemas.openxmlformats.org/drawingml/2006/main" xmlns:pic="http://schemas.openxmlformats.org/drawingml/2006/picture">
+            <wp:extent cx="5760000" cy="5512000"/>
+            <wp:docPr id="14" name="Picture 14"/>
+            <wp:cNvGraphicFramePr>
+              <a:graphicFrameLocks noChangeAspect="1"/>
+            </wp:cNvGraphicFramePr>
+            <a:graphic>
+              <a:graphicData uri="http://schemas.openxmlformats.org/drawingml/2006/picture">
+                <pic:pic>
+                  <pic:nvPicPr>
+                    <pic:cNvPr id="0" name="51_config_email.jpg"/>
+                    <pic:cNvPicPr/>
+                  </pic:nvPicPr>
+                  <pic:blipFill>
+                    <a:blip r:embed="rId22"/>
+                    <a:stretch>
+                      <a:fillRect/>
+                    </a:stretch>
+                  </pic:blipFill>
+                  <pic:spPr>
+                    <a:xfrm>
+                      <a:off x="0" y="0"/>
+                      <a:ext cx="5760000" cy="5512000"/>
+                    </a:xfrm>
+                    <a:prstGeom prst="rect"/>
+                  </pic:spPr>
+                </pic:pic>
+              </a:graphicData>
+            </a:graphic>
+          </wp:inline>
+        </w:drawing>
+      </w:r>
+    </w:p>
+    <w:p>
+      <w:pPr>
+        <w:jc w:val="center"/>
+      </w:pPr>
+      <w:r>
+        <w:rPr>
+          <w:i/>
+          <w:color w:val="4B5563"/>
+          <w:sz w:val="18"/>
+        </w:rPr>
+        <w:t>Figure — configuration e-mail : serveur SMTP, expéditeur et e-mail de test</w:t>
+      </w:r>
+    </w:p>
+    <w:p>
+      <w:pPr>
         <w:pStyle w:val="ListBullet"/>
       </w:pPr>
       <w:r>
@@ -7790,7 +7939,7 @@
         <w:pStyle w:val="ListNumber"/>
         <w:numPr>
           <w:ilvl w:val="0"/>
-          <w:numId w:val="20"/>
+          <w:numId w:val="21"/>
         </w:numPr>
       </w:pPr>
       <w:r>
@@ -7802,7 +7951,7 @@
         <w:pStyle w:val="ListNumber"/>
         <w:numPr>
           <w:ilvl w:val="0"/>
-          <w:numId w:val="20"/>
+          <w:numId w:val="21"/>
         </w:numPr>
       </w:pPr>
       <w:r>
@@ -7814,7 +7963,7 @@
         <w:pStyle w:val="ListNumber"/>
         <w:numPr>
           <w:ilvl w:val="0"/>
-          <w:numId w:val="20"/>
+          <w:numId w:val="21"/>
         </w:numPr>
       </w:pPr>
       <w:r>
@@ -10538,6 +10687,12 @@
     </w:lvlOverride>
   </w:num>
   <w:num w:numId="20">
+    <w:abstractNumId w:val="7"/>
+    <w:lvlOverride w:ilvl="0">
+      <w:startOverride w:val="1"/>
+    </w:lvlOverride>
+  </w:num>
+  <w:num w:numId="21">
     <w:abstractNumId w:val="7"/>
     <w:lvlOverride w:ilvl="0">
       <w:startOverride w:val="1"/>

</xml_diff>

<commit_message>
Guide utilisateur : refus expliqués, e-mail qui ne part pas, « Enregistrer tout »
- nouveautés 1.4 : « Refus expliqués » (Paramètres, Messagerie) et
  « E-mail qui ne part pas » (l'action est faite, la cloche prévient) ;
- §7.2 : signature enregistrée même si l'e-mail ne part pas ; type de
  notification coupé, la file de travail reste la référence ;
- §9.5 : alerte du trop-perçu (cloche, e-mail), coupable ;
- §13.2 : refus expliqué sans rien enregistrer ; encadré « Enregistrer
  tout » (relire les autres onglets, HTTPS, maintenance).

.docx régénéré ; CHANGELOG.

Co-Authored-By: Claude Opus 5.5 <noreply@anthropic.com>
Claude-Session: https://claude.ai/code/session_01MUfkbbz4qHVd6KNyyZzHX8
</commit_message>
<xml_diff>
--- a/docs/Guide-Utilisateur-ANaTT.docx
+++ b/docs/Guide-Utilisateur-ANaTT.docx
@@ -1466,6 +1466,100 @@
                 <w:b w:val="0"/>
                 <w:sz w:val="20"/>
               </w:rPr>
+              <w:t>Refus expliqués</w:t>
+            </w:r>
+          </w:p>
+        </w:tc>
+        <w:tc>
+          <w:tcPr>
+            <w:tcW w:type="dxa" w:w="6236"/>
+          </w:tcPr>
+          <w:p>
+            <w:r/>
+            <w:r>
+              <w:rPr>
+                <w:b w:val="0"/>
+                <w:sz w:val="20"/>
+              </w:rPr>
+              <w:t>Quand l'écran Paramètres ou Messagerie refuse une valeur (part d'avance hors 0-100, port invalide…), il indique laquelle et pourquoi, au lieu de « Données invalides ».</w:t>
+            </w:r>
+          </w:p>
+        </w:tc>
+        <w:tc>
+          <w:tcPr>
+            <w:tcW w:type="dxa" w:w="1247"/>
+          </w:tcPr>
+          <w:p>
+            <w:r/>
+            <w:r>
+              <w:rPr>
+                <w:b w:val="0"/>
+                <w:sz w:val="20"/>
+              </w:rPr>
+              <w:t>13.2</w:t>
+            </w:r>
+          </w:p>
+        </w:tc>
+      </w:tr>
+      <w:tr>
+        <w:tc>
+          <w:tcPr>
+            <w:tcW w:type="dxa" w:w="2041"/>
+          </w:tcPr>
+          <w:p>
+            <w:r/>
+            <w:r>
+              <w:rPr>
+                <w:b w:val="0"/>
+                <w:sz w:val="20"/>
+              </w:rPr>
+              <w:t>E-mail qui ne part pas</w:t>
+            </w:r>
+          </w:p>
+        </w:tc>
+        <w:tc>
+          <w:tcPr>
+            <w:tcW w:type="dxa" w:w="6236"/>
+          </w:tcPr>
+          <w:p>
+            <w:r/>
+            <w:r>
+              <w:rPr>
+                <w:b w:val="0"/>
+                <w:sz w:val="20"/>
+              </w:rPr>
+              <w:t>Si le serveur de messagerie ne répond pas, valider, signer, rejeter ou amender n'affiche plus d'erreur : l'action est faite, la notification apparaît dans la cloche, seul l'e-mail manque (à vérifier avec « Envoyer un e-mail de test »).</w:t>
+            </w:r>
+          </w:p>
+        </w:tc>
+        <w:tc>
+          <w:tcPr>
+            <w:tcW w:type="dxa" w:w="1247"/>
+          </w:tcPr>
+          <w:p>
+            <w:r/>
+            <w:r>
+              <w:rPr>
+                <w:b w:val="0"/>
+                <w:sz w:val="20"/>
+              </w:rPr>
+              <w:t>13.2</w:t>
+            </w:r>
+          </w:p>
+        </w:tc>
+      </w:tr>
+      <w:tr>
+        <w:tc>
+          <w:tcPr>
+            <w:tcW w:type="dxa" w:w="2041"/>
+          </w:tcPr>
+          <w:p>
+            <w:r/>
+            <w:r>
+              <w:rPr>
+                <w:b w:val="0"/>
+                <w:sz w:val="20"/>
+              </w:rPr>
               <w:t>Saisie d'une mission</w:t>
             </w:r>
           </w:p>
@@ -6337,7 +6431,7 @@
         <w:pStyle w:val="ListBullet"/>
       </w:pPr>
       <w:r>
-        <w:t>Notifications (cloche et e-mail) : à chaque étape, sont prévenus les comptes actifs qui détiennent la permission de l'étape suivante — contrôler, viser, puis valider ; à la validation finale, ceux qui génèrent les fichiers de paiement ; en cas de rejet, ceux qui retranscrivent les missions. Un rôle personnalisé ou un droit accordé à titre individuel est donc notifié ; un droit retiré ne l'est plus. Le super administrateur n'est pas notifié, et un compte désactivé ne l'est jamais.</w:t>
+        <w:t>Notifications (cloche et e-mail) : à chaque étape, sont prévenus les comptes actifs qui détiennent la permission de l'étape suivante — contrôler, viser, puis valider ; à la validation finale, ceux qui génèrent les fichiers de paiement ; en cas de rejet, ceux qui retranscrivent les missions. Un rôle personnalisé ou un droit accordé à titre individuel est donc notifié ; un droit retiré ne l'est plus. Le super administrateur n'est pas notifié, et un compte désactivé ne l'est jamais. Si le serveur de messagerie ne répond pas, la signature est tout de même enregistrée et la cloche prévient le suivant : seul l'e-mail manque. Un type de notification coupé dans « Paramètres » n'est plus émis ; la file de travail des états montre toujours ce qui attend chacun.</w:t>
       </w:r>
     </w:p>
     <w:p>
@@ -6965,6 +7059,14 @@
     </w:p>
     <w:p>
       <w:pPr>
+        <w:pStyle w:val="ListBullet"/>
+      </w:pPr>
+      <w:r>
+        <w:t>Les comptes qui constatent les recouvrements (« Paiements — confirmer », l'agent financier par défaut) en sont prévenus dans la cloche et par e-mail, sauf si cette notification est coupée dans « Paramètres » : l'écran « Régularisations » reste alors la seule alerte.</w:t>
+      </w:r>
+    </w:p>
+    <w:p>
+      <w:pPr>
         <w:pStyle w:val="ListNumber"/>
         <w:numPr>
           <w:ilvl w:val="0"/>
@@ -7417,9 +7519,44 @@
           <w:b w:val="0"/>
           <w:i w:val="0"/>
         </w:rPr>
-        <w:t>Tous les réglages de l'écran Paramètres sont appliqués par le serveur dès l'enregistrement (au plus tard une minute après). Un réglage jamais enregistré garde le comportement par défaut ; une valeur hors limites est refusée.</w:t>
+        <w:t>Tous les réglages de l'écran Paramètres sont appliqués par le serveur dès l'enregistrement (au plus tard une minute après). Un réglage jamais enregistré garde le comportement par défaut ; une valeur hors limites est refusée : l'écran indique laquelle et pourquoi (par exemple « Le pourcentage d'avance doit être un entier entre 0 et 100. ») et n'enregistre rien.</w:t>
       </w:r>
     </w:p>
+    <w:tbl>
+      <w:tblPr>
+        <w:tblW w:type="auto" w:w="0"/>
+        <w:jc w:val="center"/>
+        <w:tblLook w:firstColumn="1" w:firstRow="1" w:lastColumn="0" w:lastRow="0" w:noHBand="0" w:noVBand="1" w:val="04A0"/>
+      </w:tblPr>
+      <w:tblGrid>
+        <w:gridCol w:w="8640"/>
+      </w:tblGrid>
+      <w:tr>
+        <w:tc>
+          <w:tcPr>
+            <w:tcW w:type="dxa" w:w="9524"/>
+            <w:shd w:val="clear" w:fill="EDFAF2"/>
+          </w:tcPr>
+          <w:p>
+            <w:r>
+              <w:rPr>
+                <w:b/>
+                <w:color w:val="0A3D1F"/>
+                <w:sz w:val="20"/>
+              </w:rPr>
+              <w:t xml:space="preserve">« Enregistrer tout » : </w:t>
+            </w:r>
+            <w:r>
+              <w:rPr>
+                <w:sz w:val="20"/>
+              </w:rPr>
+              <w:t>Le bouton enregistre tous les onglets en une fois, et chacun s'applique aussitôt. Avant de changer un seul réglage (la part de l'avance, par exemple), relisez les autres onglets : n'activez « Forcer HTTPS » que si l'adresse de l'application commence déjà par https://, et vérifiez que le mode maintenance est bien désactivé.</w:t>
+            </w:r>
+          </w:p>
+        </w:tc>
+      </w:tr>
+    </w:tbl>
+    <w:p/>
     <w:tbl>
       <w:tblPr>
         <w:tblStyle w:val="TableGrid"/>

</xml_diff>

<commit_message>
Guide utilisateur : refus du barème et des exports, agent sans indice, sauvegardes rapprochées
Changements visibles depuis la dernière édition (dette soldée, n° 50, 53 à 55) :
- nouveautés 1.4 « Refus expliqués (suite) » et « Sauvegardes rapprochées » ;
- §3.5 : agent sans indice ni salaire brut, date de retour antérieure au
  départ, période d'export à l'envers ; message général réservé au serveur
  injoignable ;
- §5.2 : refus à la création d'un agent ; §10, §11 : taux et période refusés
  expliqués ; §13.3 : sauvegardes d'une même seconde (suffixe -2).

.docx régénéré ; revue §8.2 et CHANGELOG.

Co-Authored-By: Claude Opus 5.5 <noreply@anthropic.com>
Claude-Session: https://claude.ai/code/session_01MUfkbbz4qHVd6KNyyZzHX8
</commit_message>
<xml_diff>
--- a/docs/Guide-Utilisateur-ANaTT.docx
+++ b/docs/Guide-Utilisateur-ANaTT.docx
@@ -1513,6 +1513,100 @@
                 <w:b w:val="0"/>
                 <w:sz w:val="20"/>
               </w:rPr>
+              <w:t>Refus expliqués (suite)</w:t>
+            </w:r>
+          </w:p>
+        </w:tc>
+        <w:tc>
+          <w:tcPr>
+            <w:tcW w:type="dxa" w:w="6236"/>
+          </w:tcPr>
+          <w:p>
+            <w:r/>
+            <w:r>
+              <w:rPr>
+                <w:b w:val="0"/>
+                <w:sz w:val="20"/>
+              </w:rPr>
+              <w:t>Le barème et les exports de rapports donnent eux aussi la raison d'un échec (taux refusé, période invalide…), et non plus « Échec de l'enregistrement » / « Échec de l'export » ; un agent sans indice ni salaire brut est refusé avec « L'indice ou le salaire brut est requis pour déterminer la catégorie. » ; une date de retour antérieure au départ, avec « La date de retour doit être postérieure ou égale à la date de départ. ».</w:t>
+            </w:r>
+          </w:p>
+        </w:tc>
+        <w:tc>
+          <w:tcPr>
+            <w:tcW w:type="dxa" w:w="1247"/>
+          </w:tcPr>
+          <w:p>
+            <w:r/>
+            <w:r>
+              <w:rPr>
+                <w:b w:val="0"/>
+                <w:sz w:val="20"/>
+              </w:rPr>
+              <w:t>3.5, 5.2, 10, 11</w:t>
+            </w:r>
+          </w:p>
+        </w:tc>
+      </w:tr>
+      <w:tr>
+        <w:tc>
+          <w:tcPr>
+            <w:tcW w:type="dxa" w:w="2041"/>
+          </w:tcPr>
+          <w:p>
+            <w:r/>
+            <w:r>
+              <w:rPr>
+                <w:b w:val="0"/>
+                <w:sz w:val="20"/>
+              </w:rPr>
+              <w:t>Sauvegardes rapprochées</w:t>
+            </w:r>
+          </w:p>
+        </w:tc>
+        <w:tc>
+          <w:tcPr>
+            <w:tcW w:type="dxa" w:w="6236"/>
+          </w:tcPr>
+          <w:p>
+            <w:r/>
+            <w:r>
+              <w:rPr>
+                <w:b w:val="0"/>
+                <w:sz w:val="20"/>
+              </w:rPr>
+              <w:t>Deux sauvegardes prises dans la même seconde (une sauvegarde manuelle puis une restauration aussitôt, par exemple) ne s'écrasent plus : la seconde porte un suffixe « -2 ». Restaurer une sauvegarde toute récente fonctionne donc toujours.</w:t>
+            </w:r>
+          </w:p>
+        </w:tc>
+        <w:tc>
+          <w:tcPr>
+            <w:tcW w:type="dxa" w:w="1247"/>
+          </w:tcPr>
+          <w:p>
+            <w:r/>
+            <w:r>
+              <w:rPr>
+                <w:b w:val="0"/>
+                <w:sz w:val="20"/>
+              </w:rPr>
+              <w:t>13.3</w:t>
+            </w:r>
+          </w:p>
+        </w:tc>
+      </w:tr>
+      <w:tr>
+        <w:tc>
+          <w:tcPr>
+            <w:tcW w:type="dxa" w:w="2041"/>
+          </w:tcPr>
+          <w:p>
+            <w:r/>
+            <w:r>
+              <w:rPr>
+                <w:b w:val="0"/>
+                <w:sz w:val="20"/>
+              </w:rPr>
               <w:t>E-mail qui ne part pas</w:t>
             </w:r>
           </w:p>
@@ -5444,8 +5538,113 @@
           </w:p>
         </w:tc>
       </w:tr>
+      <w:tr>
+        <w:tc>
+          <w:tcPr>
+            <w:tcW w:type="dxa" w:w="3969"/>
+          </w:tcPr>
+          <w:p>
+            <w:r/>
+            <w:r>
+              <w:rPr>
+                <w:b w:val="0"/>
+                <w:sz w:val="20"/>
+              </w:rPr>
+              <w:t>Agent créé sans indice ni salaire brut</w:t>
+            </w:r>
+          </w:p>
+        </w:tc>
+        <w:tc>
+          <w:tcPr>
+            <w:tcW w:type="dxa" w:w="5556"/>
+          </w:tcPr>
+          <w:p>
+            <w:r/>
+            <w:r>
+              <w:rPr>
+                <w:b w:val="0"/>
+                <w:sz w:val="20"/>
+              </w:rPr>
+              <w:t>L'indice ou le salaire brut est requis pour déterminer la catégorie.</w:t>
+            </w:r>
+          </w:p>
+        </w:tc>
+      </w:tr>
+      <w:tr>
+        <w:tc>
+          <w:tcPr>
+            <w:tcW w:type="dxa" w:w="3969"/>
+          </w:tcPr>
+          <w:p>
+            <w:r/>
+            <w:r>
+              <w:rPr>
+                <w:b w:val="0"/>
+                <w:sz w:val="20"/>
+              </w:rPr>
+              <w:t>Mission dont la date de retour précède le départ</w:t>
+            </w:r>
+          </w:p>
+        </w:tc>
+        <w:tc>
+          <w:tcPr>
+            <w:tcW w:type="dxa" w:w="5556"/>
+          </w:tcPr>
+          <w:p>
+            <w:r/>
+            <w:r>
+              <w:rPr>
+                <w:b w:val="0"/>
+                <w:sz w:val="20"/>
+              </w:rPr>
+              <w:t>La date de retour doit être postérieure ou égale à la date de départ.</w:t>
+            </w:r>
+          </w:p>
+        </w:tc>
+      </w:tr>
+      <w:tr>
+        <w:tc>
+          <w:tcPr>
+            <w:tcW w:type="dxa" w:w="3969"/>
+          </w:tcPr>
+          <w:p>
+            <w:r/>
+            <w:r>
+              <w:rPr>
+                <w:b w:val="0"/>
+                <w:sz w:val="20"/>
+              </w:rPr>
+              <w:t>Export de rapport sur une période à l'envers</w:t>
+            </w:r>
+          </w:p>
+        </w:tc>
+        <w:tc>
+          <w:tcPr>
+            <w:tcW w:type="dxa" w:w="5556"/>
+          </w:tcPr>
+          <w:p>
+            <w:r/>
+            <w:r>
+              <w:rPr>
+                <w:b w:val="0"/>
+                <w:sz w:val="20"/>
+              </w:rPr>
+              <w:t>La date de fin doit être postérieure ou égale à la date de début.</w:t>
+            </w:r>
+          </w:p>
+        </w:tc>
+      </w:tr>
     </w:tbl>
     <w:p/>
+    <w:p>
+      <w:r>
+        <w:rPr>
+          <w:b w:val="0"/>
+          <w:i w:val="0"/>
+        </w:rPr>
+        <w:t>Sur chaque écran, y compris le barème et les exports de rapports, c'est la raison donnée par le serveur qui s'affiche. Un message général (« Échec de l'enregistrement. », « Échec de l'export. ») n'apparaît que si le serveur n'a pas pu répondre (réseau coupé) : réessayez alors un peu plus tard.</w:t>
+      </w:r>
+    </w:p>
     <w:p>
       <w:pPr>
         <w:pStyle w:val="Heading1"/>
@@ -5683,6 +5882,14 @@
     </w:p>
     <w:p>
       <w:pPr>
+        <w:pStyle w:val="ListBullet"/>
+      </w:pPr>
+      <w:r>
+        <w:t>Sans indice ni salaire brut, l'agent n'est pas créé : « L'indice ou le salaire brut est requis pour déterminer la catégorie. ». Un numéro qui ne correspond pas à l'opérateur choisi est refusé de même (« Le numéro correspond à l'opérateur MTN, pas à MOOV. »).</w:t>
+      </w:r>
+    </w:p>
+    <w:p>
+      <w:pPr>
         <w:pStyle w:val="Heading2"/>
       </w:pPr>
       <w:r>
@@ -7482,7 +7689,7 @@
         <w:pStyle w:val="ListBullet"/>
       </w:pPr>
       <w:r>
-        <w:t>Modification des taux : réservée à l'ADMIN (« Barème — modifier »).</w:t>
+        <w:t>Modification des taux : réservée à l'ADMIN (« Barème — modifier »). Un taux refusé (valeur négative, par exemple) est signalé avec sa raison ; rien n'est enregistré.</w:t>
       </w:r>
     </w:p>
     <w:p>
@@ -7540,7 +7747,7 @@
         <w:pStyle w:val="ListBullet"/>
       </w:pPr>
       <w:r>
-        <w:t>Export Excel ou PDF (immédiat ou en arrière-plan pour les gros volumes).</w:t>
+        <w:t>Export Excel ou PDF (immédiat ou en arrière-plan pour les gros volumes). Une période invalide (date de fin avant la date de début) est refusée avec sa raison.</w:t>
       </w:r>
     </w:p>
     <w:p>
@@ -8351,7 +8558,7 @@
         <w:pStyle w:val="ListBullet"/>
       </w:pPr>
       <w:r>
-        <w:t>La liste est classée de la plus récente à la plus ancienne.</w:t>
+        <w:t>La liste est classée de la plus récente à la plus ancienne. Deux sauvegardes prises dans la même seconde portent des noms distincts (suffixe « -2 », « -3 »…) : aucune n'en écrase une autre.</w:t>
       </w:r>
     </w:p>
     <w:p>

</xml_diff>